<commit_message>
feat: add admin authentication model and revenue analytics dashboard along with e-commerce frontend pages
</commit_message>
<xml_diff>
--- a/project_report.docx
+++ b/project_report.docx
@@ -433,6 +433,13 @@
     </w:p>
     <w:sdt>
       <w:sdtPr>
+        <w:rPr>
+          <w:rFonts w:ascii="Times New Roman" w:eastAsia="Times New Roman" w:hAnsi="Times New Roman" w:cs="Times New Roman"/>
+          <w:color w:val="auto"/>
+          <w:sz w:val="20"/>
+          <w:szCs w:val="20"/>
+          <w:lang w:val="en-GB" w:eastAsia="en-GB"/>
+        </w:rPr>
         <w:id w:val="-1401596757"/>
         <w:docPartObj>
           <w:docPartGallery w:val="Table of Contents"/>
@@ -441,14 +448,9 @@
       </w:sdtPr>
       <w:sdtEndPr>
         <w:rPr>
-          <w:rFonts w:ascii="Times New Roman" w:eastAsia="Times New Roman" w:hAnsi="Times New Roman" w:cs="Times New Roman"/>
           <w:b/>
           <w:bCs/>
           <w:noProof/>
-          <w:color w:val="auto"/>
-          <w:sz w:val="20"/>
-          <w:szCs w:val="20"/>
-          <w:lang w:val="en-GB" w:eastAsia="en-GB"/>
         </w:rPr>
       </w:sdtEndPr>
       <w:sdtContent>
@@ -2232,8 +2234,6 @@
         </w:rPr>
         <w:br w:type="page"/>
       </w:r>
-      <w:bookmarkStart w:id="0" w:name="_GoBack"/>
-      <w:bookmarkEnd w:id="0"/>
     </w:p>
     <w:p>
       <w:pPr>
@@ -2251,7 +2251,7 @@
           <w:szCs w:val="28"/>
         </w:rPr>
       </w:pPr>
-      <w:bookmarkStart w:id="1" w:name="_Toc233411094"/>
+      <w:bookmarkStart w:id="0" w:name="_Toc233411094"/>
       <w:r>
         <w:rPr>
           <w:rFonts w:ascii="Arial" w:eastAsia="Arial" w:hAnsi="Arial" w:cs="Arial"/>
@@ -2264,7 +2264,7 @@
         <w:lastRenderedPageBreak/>
         <w:t>Executive Summary</w:t>
       </w:r>
-      <w:bookmarkEnd w:id="1"/>
+      <w:bookmarkEnd w:id="0"/>
     </w:p>
     <w:p>
       <w:pPr>
@@ -2573,25 +2573,7 @@
           <w:sz w:val="22"/>
           <w:szCs w:val="22"/>
         </w:rPr>
-        <w:t>T</w:t>
-      </w:r>
-      <w:r>
-        <w:rPr>
-          <w:rFonts w:ascii="Arial" w:eastAsia="Arial" w:hAnsi="Arial" w:cs="Arial"/>
-          <w:color w:val="333333"/>
-          <w:sz w:val="22"/>
-          <w:szCs w:val="22"/>
-        </w:rPr>
-        <w:t xml:space="preserve">his project report describes the implementation of a modern, responsive, and full-stack E-Commerce Store with an integrated Content Management System (CMS) Admin Dashboard. The system is designed using the MEN stack (MongoDB, Express, and Node.js) on the </w:t>
-      </w:r>
-      <w:r>
-        <w:rPr>
-          <w:rFonts w:ascii="Arial" w:eastAsia="Arial" w:hAnsi="Arial" w:cs="Arial"/>
-          <w:color w:val="333333"/>
-          <w:sz w:val="22"/>
-          <w:szCs w:val="22"/>
-        </w:rPr>
-        <w:t>backend and native web technologies (HTML</w:t>
+        <w:t>This project report describes the implementation of a modern, responsive, and full-stack E-Commerce Store with an integrated Content Management System (CMS) Admin Dashboard. The system is designed using the MEN stack (MongoDB, Express, and Node.js) on the backend and native web technologies (HTML</w:t>
       </w:r>
       <w:r>
         <w:rPr>
@@ -2623,16 +2605,7 @@
           <w:sz w:val="22"/>
           <w:szCs w:val="22"/>
         </w:rPr>
-        <w:t>The system has</w:t>
-      </w:r>
-      <w:r>
-        <w:rPr>
-          <w:rFonts w:ascii="Arial" w:eastAsia="Arial" w:hAnsi="Arial" w:cs="Arial"/>
-          <w:color w:val="333333"/>
-          <w:sz w:val="22"/>
-          <w:szCs w:val="22"/>
-        </w:rPr>
-        <w:t xml:space="preserve"> been designed with two user roles in mind:</w:t>
+        <w:t>The system has been designed with two user roles in mind:</w:t>
       </w:r>
     </w:p>
     <w:p>
@@ -2670,16 +2643,7 @@
           <w:sz w:val="22"/>
           <w:szCs w:val="22"/>
         </w:rPr>
-        <w:t>Store Administrator: Can view dashboard sales analytics,</w:t>
-      </w:r>
-      <w:r>
-        <w:rPr>
-          <w:rFonts w:ascii="Arial" w:eastAsia="Arial" w:hAnsi="Arial" w:cs="Arial"/>
-          <w:color w:val="333333"/>
-          <w:sz w:val="22"/>
-          <w:szCs w:val="22"/>
-        </w:rPr>
-        <w:t xml:space="preserve"> manage products (adding multi-images/videos), update order status (Seller to Pack, Shipped, Delivered, Cancelled), and print automated Air Waybills (AWB).</w:t>
+        <w:t>Store Administrator: Can view dashboard sales analytics, manage products (adding multi-images/videos), update order status (Seller to Pack, Shipped, Delivered, Cancelled), and print automated Air Waybills (AWB).</w:t>
       </w:r>
     </w:p>
     <w:p>
@@ -2699,7 +2663,7 @@
           <w:szCs w:val="28"/>
         </w:rPr>
       </w:pPr>
-      <w:bookmarkStart w:id="2" w:name="_Toc233411095"/>
+      <w:bookmarkStart w:id="1" w:name="_Toc233411095"/>
       <w:r>
         <w:rPr>
           <w:rFonts w:ascii="Arial" w:eastAsia="Arial" w:hAnsi="Arial" w:cs="Arial"/>
@@ -2711,7 +2675,7 @@
         </w:rPr>
         <w:t>Technology Stack &amp; Infrastructure</w:t>
       </w:r>
-      <w:bookmarkEnd w:id="2"/>
+      <w:bookmarkEnd w:id="1"/>
     </w:p>
     <w:p>
       <w:pPr>
@@ -2724,16 +2688,7 @@
           <w:sz w:val="22"/>
           <w:szCs w:val="22"/>
         </w:rPr>
-        <w:t>The core architecture consists of a decoupled structure where t</w:t>
-      </w:r>
-      <w:r>
-        <w:rPr>
-          <w:rFonts w:ascii="Arial" w:eastAsia="Arial" w:hAnsi="Arial" w:cs="Arial"/>
-          <w:color w:val="333333"/>
-          <w:sz w:val="22"/>
-          <w:szCs w:val="22"/>
-        </w:rPr>
-        <w:t>he backend server exposes RESTful API endpoints, and the frontend makes asynchronous fetch calls to process data dynamically. Below is the detailed breakdown:</w:t>
+        <w:t>The core architecture consists of a decoupled structure where the backend server exposes RESTful API endpoints, and the frontend makes asynchronous fetch calls to process data dynamically. Below is the detailed breakdown:</w:t>
       </w:r>
     </w:p>
     <w:tbl>
@@ -2759,12 +2714,6 @@
         <w:gridCol w:w="5201"/>
       </w:tblGrid>
       <w:tr>
-        <w:tblPrEx>
-          <w:tblCellMar>
-            <w:top w:w="0" w:type="dxa"/>
-            <w:bottom w:w="0" w:type="dxa"/>
-          </w:tblCellMar>
-        </w:tblPrEx>
         <w:tc>
           <w:tcPr>
             <w:tcW w:w="0" w:type="auto"/>
@@ -2836,12 +2785,6 @@
         </w:tc>
       </w:tr>
       <w:tr>
-        <w:tblPrEx>
-          <w:tblCellMar>
-            <w:top w:w="0" w:type="dxa"/>
-            <w:bottom w:w="0" w:type="dxa"/>
-          </w:tblCellMar>
-        </w:tblPrEx>
         <w:tc>
           <w:tcPr>
             <w:tcW w:w="0" w:type="auto"/>
@@ -2936,12 +2879,6 @@
         </w:tc>
       </w:tr>
       <w:tr>
-        <w:tblPrEx>
-          <w:tblCellMar>
-            <w:top w:w="0" w:type="dxa"/>
-            <w:bottom w:w="0" w:type="dxa"/>
-          </w:tblCellMar>
-        </w:tblPrEx>
         <w:tc>
           <w:tcPr>
             <w:tcW w:w="0" w:type="auto"/>
@@ -3006,12 +2943,6 @@
         </w:tc>
       </w:tr>
       <w:tr>
-        <w:tblPrEx>
-          <w:tblCellMar>
-            <w:top w:w="0" w:type="dxa"/>
-            <w:bottom w:w="0" w:type="dxa"/>
-          </w:tblCellMar>
-        </w:tblPrEx>
         <w:tc>
           <w:tcPr>
             <w:tcW w:w="0" w:type="auto"/>
@@ -3092,12 +3023,6 @@
         </w:tc>
       </w:tr>
       <w:tr>
-        <w:tblPrEx>
-          <w:tblCellMar>
-            <w:top w:w="0" w:type="dxa"/>
-            <w:bottom w:w="0" w:type="dxa"/>
-          </w:tblCellMar>
-        </w:tblPrEx>
         <w:tc>
           <w:tcPr>
             <w:tcW w:w="0" w:type="auto"/>
@@ -3116,16 +3041,7 @@
                 <w:bCs/>
                 <w:color w:val="333333"/>
               </w:rPr>
-              <w:t>A</w:t>
-            </w:r>
-            <w:r>
-              <w:rPr>
-                <w:rFonts w:ascii="Arial" w:eastAsia="Arial" w:hAnsi="Arial" w:cs="Arial"/>
-                <w:b/>
-                <w:bCs/>
-                <w:color w:val="333333"/>
-              </w:rPr>
-              <w:t>uthentication</w:t>
+              <w:t>Authentication</w:t>
             </w:r>
           </w:p>
         </w:tc>
@@ -3171,12 +3087,6 @@
         </w:tc>
       </w:tr>
       <w:tr>
-        <w:tblPrEx>
-          <w:tblCellMar>
-            <w:top w:w="0" w:type="dxa"/>
-            <w:bottom w:w="0" w:type="dxa"/>
-          </w:tblCellMar>
-        </w:tblPrEx>
         <w:tc>
           <w:tcPr>
             <w:tcW w:w="0" w:type="auto"/>
@@ -3244,12 +3154,6 @@
         </w:tc>
       </w:tr>
       <w:tr>
-        <w:tblPrEx>
-          <w:tblCellMar>
-            <w:top w:w="0" w:type="dxa"/>
-            <w:bottom w:w="0" w:type="dxa"/>
-          </w:tblCellMar>
-        </w:tblPrEx>
         <w:tc>
           <w:tcPr>
             <w:tcW w:w="0" w:type="auto"/>
@@ -3310,25 +3214,12 @@
                 <w:rFonts w:ascii="Arial" w:eastAsia="Arial" w:hAnsi="Arial" w:cs="Arial"/>
                 <w:color w:val="333333"/>
               </w:rPr>
-              <w:t>Integration with SMTP rel</w:t>
-            </w:r>
-            <w:r>
-              <w:rPr>
-                <w:rFonts w:ascii="Arial" w:eastAsia="Arial" w:hAnsi="Arial" w:cs="Arial"/>
-                <w:color w:val="333333"/>
-              </w:rPr>
-              <w:t>ays to securely send OTP verification emails.</w:t>
+              <w:t>Integration with SMTP relays to securely send OTP verification emails.</w:t>
             </w:r>
           </w:p>
         </w:tc>
       </w:tr>
       <w:tr>
-        <w:tblPrEx>
-          <w:tblCellMar>
-            <w:top w:w="0" w:type="dxa"/>
-            <w:bottom w:w="0" w:type="dxa"/>
-          </w:tblCellMar>
-        </w:tblPrEx>
         <w:tc>
           <w:tcPr>
             <w:tcW w:w="0" w:type="auto"/>
@@ -3410,7 +3301,7 @@
           <w:szCs w:val="28"/>
         </w:rPr>
       </w:pPr>
-      <w:bookmarkStart w:id="3" w:name="_Toc233411096"/>
+      <w:bookmarkStart w:id="2" w:name="_Toc233411096"/>
       <w:r>
         <w:rPr>
           <w:rFonts w:ascii="Arial" w:eastAsia="Arial" w:hAnsi="Arial" w:cs="Arial"/>
@@ -3422,14 +3313,14 @@
         </w:rPr>
         <w:t>Core Features</w:t>
       </w:r>
-      <w:bookmarkEnd w:id="3"/>
+      <w:bookmarkEnd w:id="2"/>
     </w:p>
     <w:p>
       <w:pPr>
         <w:pStyle w:val="Heading2"/>
         <w:spacing w:before="300" w:after="150"/>
       </w:pPr>
-      <w:bookmarkStart w:id="4" w:name="_Toc233411097"/>
+      <w:bookmarkStart w:id="3" w:name="_Toc233411097"/>
       <w:r>
         <w:rPr>
           <w:rFonts w:ascii="Arial" w:eastAsia="Arial" w:hAnsi="Arial" w:cs="Arial"/>
@@ -3441,7 +3332,7 @@
         </w:rPr>
         <w:t>3.1 Customer Features</w:t>
       </w:r>
-      <w:bookmarkEnd w:id="4"/>
+      <w:bookmarkEnd w:id="3"/>
     </w:p>
     <w:p>
       <w:pPr>
@@ -3518,16 +3409,7 @@
           <w:sz w:val="22"/>
           <w:szCs w:val="22"/>
         </w:rPr>
-        <w:t xml:space="preserve"> &amp; Filter System: Enables users to search keywords and filter products by categories on the fly w</w:t>
-      </w:r>
-      <w:r>
-        <w:rPr>
-          <w:rFonts w:ascii="Arial" w:eastAsia="Arial" w:hAnsi="Arial" w:cs="Arial"/>
-          <w:color w:val="333333"/>
-          <w:sz w:val="22"/>
-          <w:szCs w:val="22"/>
-        </w:rPr>
-        <w:t>ithout refreshing the page.</w:t>
+        <w:t xml:space="preserve"> &amp; Filter System: Enables users to search keywords and filter products by categories on the fly without refreshing the page.</w:t>
       </w:r>
     </w:p>
     <w:p>
@@ -3575,16 +3457,7 @@
           <w:sz w:val="22"/>
           <w:szCs w:val="22"/>
         </w:rPr>
-        <w:t>bcr</w:t>
-      </w:r>
-      <w:r>
-        <w:rPr>
-          <w:rFonts w:ascii="Arial" w:eastAsia="Arial" w:hAnsi="Arial" w:cs="Arial"/>
-          <w:color w:val="333333"/>
-          <w:sz w:val="22"/>
-          <w:szCs w:val="22"/>
-        </w:rPr>
-        <w:t>yptjs</w:t>
+        <w:t>bcryptjs</w:t>
       </w:r>
       <w:proofErr w:type="spellEnd"/>
       <w:r>
@@ -3602,7 +3475,7 @@
         <w:pStyle w:val="Heading2"/>
         <w:spacing w:before="300" w:after="150"/>
       </w:pPr>
-      <w:bookmarkStart w:id="5" w:name="_Toc233411098"/>
+      <w:bookmarkStart w:id="4" w:name="_Toc233411098"/>
       <w:r>
         <w:rPr>
           <w:rFonts w:ascii="Arial" w:eastAsia="Arial" w:hAnsi="Arial" w:cs="Arial"/>
@@ -3614,7 +3487,7 @@
         </w:rPr>
         <w:t>3.2 Administrator Features</w:t>
       </w:r>
-      <w:bookmarkEnd w:id="5"/>
+      <w:bookmarkEnd w:id="4"/>
     </w:p>
     <w:p>
       <w:pPr>
@@ -3632,16 +3505,7 @@
           <w:sz w:val="22"/>
           <w:szCs w:val="22"/>
         </w:rPr>
-        <w:t>Analytics Engine: Dashboard widgets displaying Total Earnings, Order Counts, and critical notifications s</w:t>
-      </w:r>
-      <w:r>
-        <w:rPr>
-          <w:rFonts w:ascii="Arial" w:eastAsia="Arial" w:hAnsi="Arial" w:cs="Arial"/>
-          <w:color w:val="333333"/>
-          <w:sz w:val="22"/>
-          <w:szCs w:val="22"/>
-        </w:rPr>
-        <w:t>uch as Low Stock alerts.</w:t>
+        <w:t>Analytics Engine: Dashboard widgets displaying Total Earnings, Order Counts, and critical notifications such as Low Stock alerts.</w:t>
       </w:r>
     </w:p>
     <w:p>
@@ -3736,16 +3600,7 @@
           <w:sz w:val="22"/>
           <w:szCs w:val="22"/>
         </w:rPr>
-        <w:t>Automated Air Waybill Generator: Renders clean shipping labels with custom barcodes, customer address details, weight,</w:t>
-      </w:r>
-      <w:r>
-        <w:rPr>
-          <w:rFonts w:ascii="Arial" w:eastAsia="Arial" w:hAnsi="Arial" w:cs="Arial"/>
-          <w:color w:val="333333"/>
-          <w:sz w:val="22"/>
-          <w:szCs w:val="22"/>
-        </w:rPr>
-        <w:t xml:space="preserve"> and automated pricing, downloadable instantly in PDF format.</w:t>
+        <w:t>Automated Air Waybill Generator: Renders clean shipping labels with custom barcodes, customer address details, weight, and automated pricing, downloadable instantly in PDF format.</w:t>
       </w:r>
     </w:p>
     <w:p>
@@ -3757,7 +3612,7 @@
         </w:numPr>
         <w:spacing w:before="400" w:after="200"/>
       </w:pPr>
-      <w:bookmarkStart w:id="6" w:name="_Toc233411099"/>
+      <w:bookmarkStart w:id="5" w:name="_Toc233411099"/>
       <w:r>
         <w:rPr>
           <w:rFonts w:ascii="Arial" w:eastAsia="Arial" w:hAnsi="Arial" w:cs="Arial"/>
@@ -3769,7 +3624,7 @@
         </w:rPr>
         <w:t>Database Schema Design</w:t>
       </w:r>
-      <w:bookmarkEnd w:id="6"/>
+      <w:bookmarkEnd w:id="5"/>
     </w:p>
     <w:p>
       <w:pPr>
@@ -3782,16 +3637,7 @@
           <w:sz w:val="22"/>
           <w:szCs w:val="22"/>
         </w:rPr>
-        <w:t>T</w:t>
-      </w:r>
-      <w:r>
-        <w:rPr>
-          <w:rFonts w:ascii="Arial" w:eastAsia="Arial" w:hAnsi="Arial" w:cs="Arial"/>
-          <w:color w:val="333333"/>
-          <w:sz w:val="22"/>
-          <w:szCs w:val="22"/>
-        </w:rPr>
-        <w:t>he database contains four collection schemas configured using Mongoose:</w:t>
+        <w:t>The database contains four collection schemas configured using Mongoose:</w:t>
       </w:r>
     </w:p>
     <w:p>
@@ -3799,7 +3645,7 @@
         <w:pStyle w:val="Heading2"/>
         <w:spacing w:before="300" w:after="150"/>
       </w:pPr>
-      <w:bookmarkStart w:id="7" w:name="_Toc233411100"/>
+      <w:bookmarkStart w:id="6" w:name="_Toc233411100"/>
       <w:r>
         <w:rPr>
           <w:rFonts w:ascii="Arial" w:eastAsia="Arial" w:hAnsi="Arial" w:cs="Arial"/>
@@ -3811,7 +3657,7 @@
         </w:rPr>
         <w:t>4.1 User Schema</w:t>
       </w:r>
-      <w:bookmarkEnd w:id="7"/>
+      <w:bookmarkEnd w:id="6"/>
     </w:p>
     <w:p>
       <w:pPr>
@@ -3955,7 +3801,7 @@
         <w:pStyle w:val="Heading2"/>
         <w:spacing w:before="300" w:after="150"/>
       </w:pPr>
-      <w:bookmarkStart w:id="8" w:name="_Toc233411101"/>
+      <w:bookmarkStart w:id="7" w:name="_Toc233411101"/>
       <w:r>
         <w:rPr>
           <w:rFonts w:ascii="Arial" w:eastAsia="Arial" w:hAnsi="Arial" w:cs="Arial"/>
@@ -3967,7 +3813,7 @@
         </w:rPr>
         <w:t>4.2 Admin Schema</w:t>
       </w:r>
-      <w:bookmarkEnd w:id="8"/>
+      <w:bookmarkEnd w:id="7"/>
     </w:p>
     <w:p>
       <w:pPr>
@@ -4032,7 +3878,7 @@
         <w:pStyle w:val="Heading2"/>
         <w:spacing w:before="300" w:after="150"/>
       </w:pPr>
-      <w:bookmarkStart w:id="9" w:name="_Toc233411102"/>
+      <w:bookmarkStart w:id="8" w:name="_Toc233411102"/>
       <w:r>
         <w:rPr>
           <w:rFonts w:ascii="Arial" w:eastAsia="Arial" w:hAnsi="Arial" w:cs="Arial"/>
@@ -4044,7 +3890,7 @@
         </w:rPr>
         <w:t>4.3 Product Schema</w:t>
       </w:r>
-      <w:bookmarkEnd w:id="9"/>
+      <w:bookmarkEnd w:id="8"/>
     </w:p>
     <w:p>
       <w:pPr>
@@ -4120,16 +3966,7 @@
           <w:sz w:val="22"/>
           <w:szCs w:val="22"/>
         </w:rPr>
-        <w:t>stock / sold (Numbers): Inventory m</w:t>
-      </w:r>
-      <w:r>
-        <w:rPr>
-          <w:rFonts w:ascii="Arial" w:eastAsia="Arial" w:hAnsi="Arial" w:cs="Arial"/>
-          <w:color w:val="333333"/>
-          <w:sz w:val="22"/>
-          <w:szCs w:val="22"/>
-        </w:rPr>
-        <w:t>onitoring.</w:t>
+        <w:t>stock / sold (Numbers): Inventory monitoring.</w:t>
       </w:r>
     </w:p>
     <w:p>
@@ -4156,7 +3993,7 @@
         <w:pStyle w:val="Heading2"/>
         <w:spacing w:before="300" w:after="150"/>
       </w:pPr>
-      <w:bookmarkStart w:id="10" w:name="_Toc233411103"/>
+      <w:bookmarkStart w:id="9" w:name="_Toc233411103"/>
       <w:r>
         <w:rPr>
           <w:rFonts w:ascii="Arial" w:eastAsia="Arial" w:hAnsi="Arial" w:cs="Arial"/>
@@ -4168,7 +4005,7 @@
         </w:rPr>
         <w:t>4.4 Order Schema</w:t>
       </w:r>
-      <w:bookmarkEnd w:id="10"/>
+      <w:bookmarkEnd w:id="9"/>
     </w:p>
     <w:p>
       <w:pPr>
@@ -4276,16 +4113,7 @@
           <w:sz w:val="22"/>
           <w:szCs w:val="22"/>
         </w:rPr>
-        <w:t xml:space="preserve">status (String): Current tracking </w:t>
-      </w:r>
-      <w:r>
-        <w:rPr>
-          <w:rFonts w:ascii="Arial" w:eastAsia="Arial" w:hAnsi="Arial" w:cs="Arial"/>
-          <w:color w:val="333333"/>
-          <w:sz w:val="22"/>
-          <w:szCs w:val="22"/>
-        </w:rPr>
-        <w:t>state.</w:t>
+        <w:t>status (String): Current tracking state.</w:t>
       </w:r>
     </w:p>
     <w:p>
@@ -4327,7 +4155,7 @@
         </w:numPr>
         <w:spacing w:before="400" w:after="200"/>
       </w:pPr>
-      <w:bookmarkStart w:id="11" w:name="_Toc233411104"/>
+      <w:bookmarkStart w:id="10" w:name="_Toc233411104"/>
       <w:r>
         <w:rPr>
           <w:rFonts w:ascii="Arial" w:eastAsia="Arial" w:hAnsi="Arial" w:cs="Arial"/>
@@ -4339,7 +4167,7 @@
         </w:rPr>
         <w:t>Application Interface Walkthrough</w:t>
       </w:r>
-      <w:bookmarkEnd w:id="11"/>
+      <w:bookmarkEnd w:id="10"/>
     </w:p>
     <w:p>
       <w:pPr>
@@ -4360,7 +4188,7 @@
         <w:pStyle w:val="Heading2"/>
         <w:spacing w:before="300" w:after="150"/>
       </w:pPr>
-      <w:bookmarkStart w:id="12" w:name="_Toc233411105"/>
+      <w:bookmarkStart w:id="11" w:name="_Toc233411105"/>
       <w:r>
         <w:rPr>
           <w:rFonts w:ascii="Arial" w:eastAsia="Arial" w:hAnsi="Arial" w:cs="Arial"/>
@@ -4383,7 +4211,7 @@
         </w:rPr>
         <w:t>.1 E-Commerce Landing Page (Index)</w:t>
       </w:r>
-      <w:bookmarkEnd w:id="12"/>
+      <w:bookmarkEnd w:id="11"/>
     </w:p>
     <w:p>
       <w:pPr>
@@ -4402,16 +4230,7 @@
           <w:sz w:val="22"/>
           <w:szCs w:val="22"/>
         </w:rPr>
-        <w:t>The store home page showing product s</w:t>
-      </w:r>
-      <w:r>
-        <w:rPr>
-          <w:rFonts w:ascii="Arial" w:eastAsia="Arial" w:hAnsi="Arial" w:cs="Arial"/>
-          <w:color w:val="333333"/>
-          <w:sz w:val="22"/>
-          <w:szCs w:val="22"/>
-        </w:rPr>
-        <w:t>lider, featured categories, and footer newsletter subscription.</w:t>
+        <w:t>The store home page showing product slider, featured categories, and footer newsletter subscription.</w:t>
       </w:r>
     </w:p>
     <w:p>
@@ -4419,6 +4238,9 @@
         <w:spacing w:before="100" w:after="100"/>
       </w:pPr>
       <w:r>
+        <w:rPr>
+          <w:noProof/>
+        </w:rPr>
         <w:drawing>
           <wp:inline distT="0" distB="0" distL="0" distR="0" wp14:anchorId="59F78BDB" wp14:editId="08BD459A">
             <wp:extent cx="5731510" cy="3111500"/>
@@ -4514,6 +4336,9 @@
         <w:spacing w:before="100" w:after="100"/>
       </w:pPr>
       <w:r>
+        <w:rPr>
+          <w:noProof/>
+        </w:rPr>
         <w:drawing>
           <wp:inline distT="0" distB="0" distL="0" distR="0" wp14:anchorId="6023CDC8" wp14:editId="589A4B45">
             <wp:extent cx="5731510" cy="3089910"/>
@@ -4556,7 +4381,7 @@
         <w:pStyle w:val="Heading2"/>
         <w:spacing w:before="300" w:after="150"/>
       </w:pPr>
-      <w:bookmarkStart w:id="13" w:name="_Toc233411106"/>
+      <w:bookmarkStart w:id="12" w:name="_Toc233411106"/>
       <w:r>
         <w:rPr>
           <w:rFonts w:ascii="Arial" w:eastAsia="Arial" w:hAnsi="Arial" w:cs="Arial"/>
@@ -4579,7 +4404,7 @@
         </w:rPr>
         <w:t>.2 Shop Grid &amp; Category Navigation</w:t>
       </w:r>
-      <w:bookmarkEnd w:id="13"/>
+      <w:bookmarkEnd w:id="12"/>
     </w:p>
     <w:p>
       <w:pPr>
@@ -4606,6 +4431,9 @@
         <w:spacing w:before="100" w:after="100"/>
       </w:pPr>
       <w:r>
+        <w:rPr>
+          <w:noProof/>
+        </w:rPr>
         <w:drawing>
           <wp:inline distT="0" distB="0" distL="0" distR="0" wp14:anchorId="32467933" wp14:editId="54A458EA">
             <wp:extent cx="5731510" cy="3074670"/>
@@ -4718,7 +4546,7 @@
         <w:pStyle w:val="Heading2"/>
         <w:spacing w:before="300" w:after="150"/>
       </w:pPr>
-      <w:bookmarkStart w:id="14" w:name="_Toc233411107"/>
+      <w:bookmarkStart w:id="13" w:name="_Toc233411107"/>
       <w:r>
         <w:rPr>
           <w:rFonts w:ascii="Arial" w:eastAsia="Arial" w:hAnsi="Arial" w:cs="Arial"/>
@@ -4741,7 +4569,7 @@
         </w:rPr>
         <w:t>.3 Single Product Detailed Page</w:t>
       </w:r>
-      <w:bookmarkEnd w:id="14"/>
+      <w:bookmarkEnd w:id="13"/>
     </w:p>
     <w:p>
       <w:pPr>
@@ -4776,6 +4604,9 @@
         </w:rPr>
       </w:pPr>
       <w:r>
+        <w:rPr>
+          <w:noProof/>
+        </w:rPr>
         <w:drawing>
           <wp:inline distT="0" distB="0" distL="0" distR="0" wp14:anchorId="3FF3FC79" wp14:editId="0E298447">
             <wp:extent cx="5731510" cy="3083560"/>
@@ -4869,18 +4700,7 @@
           <w:sz w:val="24"/>
           <w:szCs w:val="24"/>
         </w:rPr>
-        <w:t xml:space="preserve"> About Us</w:t>
-      </w:r>
-      <w:r>
-        <w:rPr>
-          <w:rFonts w:ascii="Arial" w:eastAsia="Arial" w:hAnsi="Arial" w:cs="Arial"/>
-          <w:b/>
-          <w:bCs/>
-          <w:color w:val="495057"/>
-          <w:sz w:val="24"/>
-          <w:szCs w:val="24"/>
-        </w:rPr>
-        <w:t xml:space="preserve"> Page</w:t>
+        <w:t xml:space="preserve"> About Us Page</w:t>
       </w:r>
     </w:p>
     <w:p>
@@ -4892,6 +4712,7 @@
       <w:r>
         <w:rPr>
           <w:rFonts w:eastAsia="Arial"/>
+          <w:noProof/>
         </w:rPr>
         <w:drawing>
           <wp:inline distT="0" distB="0" distL="0" distR="0" wp14:anchorId="69C454DB" wp14:editId="2BF85730">
@@ -4971,7 +4792,7 @@
           <w:szCs w:val="24"/>
         </w:rPr>
       </w:pPr>
-      <w:bookmarkStart w:id="15" w:name="_Toc233411108"/>
+      <w:bookmarkStart w:id="14" w:name="_Toc233411108"/>
       <w:r>
         <w:rPr>
           <w:rFonts w:ascii="Arial" w:eastAsia="Arial" w:hAnsi="Arial" w:cs="Arial"/>
@@ -5025,20 +4846,9 @@
           <w:sz w:val="24"/>
           <w:szCs w:val="24"/>
         </w:rPr>
-        <w:t>Contact Us</w:t>
-      </w:r>
-      <w:r>
-        <w:rPr>
-          <w:rFonts w:ascii="Arial" w:eastAsia="Arial" w:hAnsi="Arial" w:cs="Arial"/>
-          <w:b/>
-          <w:bCs/>
-          <w:color w:val="495057"/>
-          <w:sz w:val="24"/>
-          <w:szCs w:val="24"/>
-        </w:rPr>
-        <w:t xml:space="preserve"> Page</w:t>
-      </w:r>
-      <w:bookmarkEnd w:id="15"/>
+        <w:t>Contact Us Page</w:t>
+      </w:r>
+      <w:bookmarkEnd w:id="14"/>
     </w:p>
     <w:p>
       <w:pPr>
@@ -5049,6 +4859,7 @@
       <w:r>
         <w:rPr>
           <w:rFonts w:eastAsia="Arial"/>
+          <w:noProof/>
         </w:rPr>
         <w:lastRenderedPageBreak/>
         <w:drawing>
@@ -5135,7 +4946,7 @@
         <w:pStyle w:val="Heading2"/>
         <w:spacing w:before="300" w:after="150"/>
       </w:pPr>
-      <w:bookmarkStart w:id="16" w:name="_Toc233411109"/>
+      <w:bookmarkStart w:id="15" w:name="_Toc233411109"/>
       <w:r>
         <w:rPr>
           <w:rFonts w:ascii="Arial" w:eastAsia="Arial" w:hAnsi="Arial" w:cs="Arial"/>
@@ -5169,7 +4980,7 @@
         </w:rPr>
         <w:t xml:space="preserve"> Interactive Shopping Cart</w:t>
       </w:r>
-      <w:bookmarkEnd w:id="16"/>
+      <w:bookmarkEnd w:id="15"/>
     </w:p>
     <w:p>
       <w:pPr>
@@ -5204,6 +5015,9 @@
         </w:rPr>
       </w:pPr>
       <w:r>
+        <w:rPr>
+          <w:noProof/>
+        </w:rPr>
         <w:drawing>
           <wp:inline distT="0" distB="0" distL="0" distR="0" wp14:anchorId="476A3443" wp14:editId="5063C3E8">
             <wp:extent cx="5731510" cy="3077845"/>
@@ -5348,16 +5162,7 @@
           <w:sz w:val="22"/>
           <w:szCs w:val="22"/>
         </w:rPr>
-        <w:t>B</w:t>
-      </w:r>
-      <w:r>
-        <w:rPr>
-          <w:rFonts w:ascii="Arial" w:eastAsia="Arial" w:hAnsi="Arial" w:cs="Arial"/>
-          <w:color w:val="333333"/>
-          <w:sz w:val="22"/>
-          <w:szCs w:val="22"/>
-        </w:rPr>
-        <w:t>illing address capture, total calculation including shipping, and order submission.</w:t>
+        <w:t>Billing address capture, total calculation including shipping, and order submission.</w:t>
       </w:r>
     </w:p>
     <w:p>
@@ -5365,6 +5170,9 @@
         <w:spacing w:before="100" w:after="100"/>
       </w:pPr>
       <w:r>
+        <w:rPr>
+          <w:noProof/>
+        </w:rPr>
         <w:drawing>
           <wp:inline distT="0" distB="0" distL="0" distR="0" wp14:anchorId="1E5F85C2" wp14:editId="519B1B39">
             <wp:extent cx="5731510" cy="3077845"/>
@@ -5439,6 +5247,9 @@
         <w:spacing w:before="100" w:after="100"/>
       </w:pPr>
       <w:r>
+        <w:rPr>
+          <w:noProof/>
+        </w:rPr>
         <w:drawing>
           <wp:inline distT="0" distB="0" distL="0" distR="0" wp14:anchorId="467038F1" wp14:editId="5A454A38">
             <wp:extent cx="5731510" cy="3086735"/>
@@ -5532,7 +5343,7 @@
         <w:pStyle w:val="Heading2"/>
         <w:spacing w:before="300" w:after="150"/>
       </w:pPr>
-      <w:bookmarkStart w:id="17" w:name="_Toc233411110"/>
+      <w:bookmarkStart w:id="16" w:name="_Toc233411110"/>
       <w:r>
         <w:rPr>
           <w:rFonts w:ascii="Arial" w:eastAsia="Arial" w:hAnsi="Arial" w:cs="Arial"/>
@@ -5567,7 +5378,7 @@
         </w:rPr>
         <w:t xml:space="preserve"> Customer Authentication &amp; OTP Recovery</w:t>
       </w:r>
-      <w:bookmarkEnd w:id="17"/>
+      <w:bookmarkEnd w:id="16"/>
     </w:p>
     <w:p>
       <w:pPr>
@@ -5586,16 +5397,7 @@
           <w:sz w:val="22"/>
           <w:szCs w:val="22"/>
         </w:rPr>
-        <w:t>U</w:t>
-      </w:r>
-      <w:r>
-        <w:rPr>
-          <w:rFonts w:ascii="Arial" w:eastAsia="Arial" w:hAnsi="Arial" w:cs="Arial"/>
-          <w:color w:val="333333"/>
-          <w:sz w:val="22"/>
-          <w:szCs w:val="22"/>
-        </w:rPr>
-        <w:t xml:space="preserve">ser Login and </w:t>
+        <w:t xml:space="preserve">User Login and </w:t>
       </w:r>
       <w:proofErr w:type="spellStart"/>
       <w:r>
@@ -5623,6 +5425,9 @@
         <w:spacing w:before="100" w:after="100"/>
       </w:pPr>
       <w:r>
+        <w:rPr>
+          <w:noProof/>
+        </w:rPr>
         <w:drawing>
           <wp:inline distT="0" distB="0" distL="0" distR="0" wp14:anchorId="2F3D29ED" wp14:editId="587E2BEF">
             <wp:extent cx="5731510" cy="3086735"/>
@@ -5719,6 +5524,9 @@
         <w:spacing w:before="100" w:after="100"/>
       </w:pPr>
       <w:r>
+        <w:rPr>
+          <w:noProof/>
+        </w:rPr>
         <w:drawing>
           <wp:inline distT="0" distB="0" distL="0" distR="0" wp14:anchorId="7B684A8F" wp14:editId="6B014EE0">
             <wp:extent cx="5731510" cy="3079115"/>
@@ -5827,6 +5635,9 @@
         <w:spacing w:before="100" w:after="100"/>
       </w:pPr>
       <w:r>
+        <w:rPr>
+          <w:noProof/>
+        </w:rPr>
         <w:lastRenderedPageBreak/>
         <w:drawing>
           <wp:inline distT="0" distB="0" distL="0" distR="0" wp14:anchorId="2C3BDC31" wp14:editId="0F7AFE2C">
@@ -5870,7 +5681,7 @@
         <w:pStyle w:val="Heading2"/>
         <w:spacing w:before="300" w:after="150"/>
       </w:pPr>
-      <w:bookmarkStart w:id="18" w:name="_Toc233411111"/>
+      <w:bookmarkStart w:id="17" w:name="_Toc233411111"/>
       <w:r>
         <w:rPr>
           <w:rFonts w:ascii="Arial" w:eastAsia="Arial" w:hAnsi="Arial" w:cs="Arial"/>
@@ -5904,7 +5715,7 @@
         </w:rPr>
         <w:t xml:space="preserve"> Admin Login Portal</w:t>
       </w:r>
-      <w:bookmarkEnd w:id="18"/>
+      <w:bookmarkEnd w:id="17"/>
     </w:p>
     <w:p>
       <w:pPr>
@@ -5923,16 +5734,7 @@
           <w:sz w:val="22"/>
           <w:szCs w:val="22"/>
         </w:rPr>
-        <w:t xml:space="preserve">Secure </w:t>
-      </w:r>
-      <w:r>
-        <w:rPr>
-          <w:rFonts w:ascii="Arial" w:eastAsia="Arial" w:hAnsi="Arial" w:cs="Arial"/>
-          <w:color w:val="333333"/>
-          <w:sz w:val="22"/>
-          <w:szCs w:val="22"/>
-        </w:rPr>
-        <w:t>administrator authorization access panel.</w:t>
+        <w:t>Secure administrator authorization access panel.</w:t>
       </w:r>
     </w:p>
     <w:p>
@@ -5940,6 +5742,9 @@
         <w:spacing w:before="100" w:after="100"/>
       </w:pPr>
       <w:r>
+        <w:rPr>
+          <w:noProof/>
+        </w:rPr>
         <w:drawing>
           <wp:inline distT="0" distB="0" distL="0" distR="0" wp14:anchorId="7C75A490" wp14:editId="48372C90">
             <wp:extent cx="5731510" cy="3074670"/>
@@ -6052,7 +5857,7 @@
         <w:pStyle w:val="Heading2"/>
         <w:spacing w:before="300" w:after="150"/>
       </w:pPr>
-      <w:bookmarkStart w:id="19" w:name="_Toc233411112"/>
+      <w:bookmarkStart w:id="18" w:name="_Toc233411112"/>
       <w:r>
         <w:rPr>
           <w:rFonts w:ascii="Arial" w:eastAsia="Arial" w:hAnsi="Arial" w:cs="Arial"/>
@@ -6087,7 +5892,7 @@
         </w:rPr>
         <w:t xml:space="preserve"> Admin Management Dashboard</w:t>
       </w:r>
-      <w:bookmarkEnd w:id="19"/>
+      <w:bookmarkEnd w:id="18"/>
     </w:p>
     <w:p>
       <w:pPr>
@@ -6114,6 +5919,9 @@
         <w:spacing w:before="100" w:after="100"/>
       </w:pPr>
       <w:r>
+        <w:rPr>
+          <w:noProof/>
+        </w:rPr>
         <w:drawing>
           <wp:inline distT="0" distB="0" distL="0" distR="0" wp14:anchorId="07B55AB8" wp14:editId="5366067B">
             <wp:extent cx="5731510" cy="3074670"/>
@@ -6232,6 +6040,7 @@
           <w:rFonts w:ascii="Arial" w:eastAsia="Arial" w:hAnsi="Arial" w:cs="Arial"/>
           <w:b/>
           <w:bCs/>
+          <w:noProof/>
           <w:color w:val="495057"/>
           <w:sz w:val="24"/>
           <w:szCs w:val="24"/>
@@ -6303,6 +6112,7 @@
           <w:rFonts w:ascii="Arial" w:eastAsia="Arial" w:hAnsi="Arial" w:cs="Arial"/>
           <w:b/>
           <w:bCs/>
+          <w:noProof/>
           <w:color w:val="495057"/>
           <w:sz w:val="24"/>
           <w:szCs w:val="24"/>
@@ -6375,6 +6185,7 @@
           <w:rFonts w:ascii="Arial" w:eastAsia="Arial" w:hAnsi="Arial" w:cs="Arial"/>
           <w:b/>
           <w:bCs/>
+          <w:noProof/>
           <w:color w:val="495057"/>
           <w:sz w:val="24"/>
           <w:szCs w:val="24"/>
@@ -6448,7 +6259,7 @@
         <w:pStyle w:val="Heading2"/>
         <w:spacing w:before="300" w:after="150"/>
       </w:pPr>
-      <w:bookmarkStart w:id="20" w:name="_Toc233411113"/>
+      <w:bookmarkStart w:id="19" w:name="_Toc233411113"/>
       <w:r>
         <w:rPr>
           <w:rFonts w:ascii="Arial" w:eastAsia="Arial" w:hAnsi="Arial" w:cs="Arial"/>
@@ -6493,7 +6304,7 @@
         </w:rPr>
         <w:t xml:space="preserve"> Admin CMS - Product Management</w:t>
       </w:r>
-      <w:bookmarkEnd w:id="20"/>
+      <w:bookmarkEnd w:id="19"/>
     </w:p>
     <w:p>
       <w:pPr>
@@ -6512,16 +6323,7 @@
           <w:sz w:val="22"/>
           <w:szCs w:val="22"/>
         </w:rPr>
-        <w:t>A</w:t>
-      </w:r>
-      <w:r>
-        <w:rPr>
-          <w:rFonts w:ascii="Arial" w:eastAsia="Arial" w:hAnsi="Arial" w:cs="Arial"/>
-          <w:color w:val="333333"/>
-          <w:sz w:val="22"/>
-          <w:szCs w:val="22"/>
-        </w:rPr>
-        <w:t>dding new products with multi-image selectors, video files, weights, and stock adjustments.</w:t>
+        <w:t>Adding new products with multi-image selectors, video files, weights, and stock adjustments.</w:t>
       </w:r>
     </w:p>
     <w:p>
@@ -6529,6 +6331,9 @@
         <w:spacing w:before="100" w:after="100"/>
       </w:pPr>
       <w:r>
+        <w:rPr>
+          <w:noProof/>
+        </w:rPr>
         <w:lastRenderedPageBreak/>
         <w:drawing>
           <wp:inline distT="0" distB="0" distL="0" distR="0" wp14:anchorId="5E81849A" wp14:editId="29C8DECA">
@@ -6612,6 +6417,9 @@
         <w:spacing w:before="100" w:after="100"/>
       </w:pPr>
       <w:r>
+        <w:rPr>
+          <w:noProof/>
+        </w:rPr>
         <w:drawing>
           <wp:inline distT="0" distB="0" distL="0" distR="0" wp14:anchorId="1A17B2DE" wp14:editId="1A35AD11">
             <wp:extent cx="5731510" cy="3077845"/>
@@ -6682,7 +6490,7 @@
         <w:pStyle w:val="Heading2"/>
         <w:spacing w:before="300" w:after="150"/>
       </w:pPr>
-      <w:bookmarkStart w:id="21" w:name="_Toc233411114"/>
+      <w:bookmarkStart w:id="20" w:name="_Toc233411114"/>
       <w:r>
         <w:rPr>
           <w:rFonts w:ascii="Arial" w:eastAsia="Arial" w:hAnsi="Arial" w:cs="Arial"/>
@@ -6714,20 +6522,9 @@
           <w:sz w:val="24"/>
           <w:szCs w:val="24"/>
         </w:rPr>
-        <w:t xml:space="preserve"> Admin - Order Track</w:t>
-      </w:r>
-      <w:r>
-        <w:rPr>
-          <w:rFonts w:ascii="Arial" w:eastAsia="Arial" w:hAnsi="Arial" w:cs="Arial"/>
-          <w:b/>
-          <w:bCs/>
-          <w:color w:val="495057"/>
-          <w:sz w:val="24"/>
-          <w:szCs w:val="24"/>
-        </w:rPr>
-        <w:t>ing &amp; AWB PDF Generation</w:t>
-      </w:r>
-      <w:bookmarkEnd w:id="21"/>
+        <w:t xml:space="preserve"> Admin - Order Tracking &amp; AWB PDF Generation</w:t>
+      </w:r>
+      <w:bookmarkEnd w:id="20"/>
     </w:p>
     <w:p>
       <w:pPr>
@@ -6754,6 +6551,9 @@
         <w:spacing w:before="100" w:after="100"/>
       </w:pPr>
       <w:r>
+        <w:rPr>
+          <w:noProof/>
+        </w:rPr>
         <w:lastRenderedPageBreak/>
         <w:drawing>
           <wp:inline distT="0" distB="0" distL="0" distR="0" wp14:anchorId="183D246B" wp14:editId="7CAADC08">
@@ -6837,6 +6637,9 @@
         <w:spacing w:before="100" w:after="100"/>
       </w:pPr>
       <w:r>
+        <w:rPr>
+          <w:noProof/>
+        </w:rPr>
         <w:drawing>
           <wp:inline distT="0" distB="0" distL="0" distR="0" wp14:anchorId="41C823D4" wp14:editId="36135ED9">
             <wp:extent cx="5731510" cy="3085465"/>
@@ -7005,6 +6808,9 @@
         <w:spacing w:before="100" w:after="100"/>
       </w:pPr>
       <w:r>
+        <w:rPr>
+          <w:noProof/>
+        </w:rPr>
         <w:lastRenderedPageBreak/>
         <w:drawing>
           <wp:inline distT="0" distB="0" distL="0" distR="0" wp14:anchorId="202A74B7" wp14:editId="17CC47B5">
@@ -7052,7 +6858,7 @@
         </w:numPr>
         <w:spacing w:before="400" w:after="200"/>
       </w:pPr>
-      <w:bookmarkStart w:id="22" w:name="_Toc233411115"/>
+      <w:bookmarkStart w:id="21" w:name="_Toc233411115"/>
       <w:r>
         <w:rPr>
           <w:rFonts w:ascii="Arial" w:eastAsia="Arial" w:hAnsi="Arial" w:cs="Arial"/>
@@ -7062,9 +6868,69 @@
           <w:sz w:val="28"/>
           <w:szCs w:val="28"/>
         </w:rPr>
-        <w:t>Conclusion &amp; Fu</w:t>
-      </w:r>
-      <w:r>
+        <w:t>Conclusion &amp; Future Scope</w:t>
+      </w:r>
+      <w:bookmarkEnd w:id="21"/>
+    </w:p>
+    <w:p>
+      <w:pPr>
+        <w:spacing w:before="100" w:after="100"/>
+        <w:rPr>
+          <w:rFonts w:ascii="Arial" w:eastAsia="Arial" w:hAnsi="Arial" w:cs="Arial"/>
+          <w:color w:val="333333"/>
+          <w:sz w:val="22"/>
+          <w:szCs w:val="22"/>
+        </w:rPr>
+      </w:pPr>
+      <w:r>
+        <w:rPr>
+          <w:rFonts w:ascii="Arial" w:eastAsia="Arial" w:hAnsi="Arial" w:cs="Arial"/>
+          <w:color w:val="333333"/>
+          <w:sz w:val="22"/>
+          <w:szCs w:val="22"/>
+        </w:rPr>
+        <w:t>The project provides a stable, performant foundation for an e-commerce platform. Moving away from client-side UI frameworks ensures that pages load rapidly even on slower mobile networks. Future updates could implement automated email tracking links, credit card payment integration (e.g., Stripe/</w:t>
+      </w:r>
+      <w:proofErr w:type="spellStart"/>
+      <w:r>
+        <w:rPr>
+          <w:rFonts w:ascii="Arial" w:eastAsia="Arial" w:hAnsi="Arial" w:cs="Arial"/>
+          <w:color w:val="333333"/>
+          <w:sz w:val="22"/>
+          <w:szCs w:val="22"/>
+        </w:rPr>
+        <w:t>EasyPaisa</w:t>
+      </w:r>
+      <w:proofErr w:type="spellEnd"/>
+      <w:r>
+        <w:rPr>
+          <w:rFonts w:ascii="Arial" w:eastAsia="Arial" w:hAnsi="Arial" w:cs="Arial"/>
+          <w:color w:val="333333"/>
+          <w:sz w:val="22"/>
+          <w:szCs w:val="22"/>
+        </w:rPr>
+        <w:t>), and advanced admin notifications for out-of-stock items.</w:t>
+      </w:r>
+    </w:p>
+    <w:p>
+      <w:pPr>
+        <w:spacing w:before="100" w:after="100"/>
+        <w:rPr>
+          <w:rFonts w:ascii="Arial" w:eastAsia="Arial" w:hAnsi="Arial" w:cs="Arial"/>
+          <w:color w:val="333333"/>
+          <w:sz w:val="22"/>
+          <w:szCs w:val="22"/>
+        </w:rPr>
+      </w:pPr>
+    </w:p>
+    <w:p>
+      <w:pPr>
+        <w:pStyle w:val="Heading1"/>
+        <w:numPr>
+          <w:ilvl w:val="0"/>
+          <w:numId w:val="3"/>
+        </w:numPr>
+        <w:spacing w:before="400" w:after="200"/>
         <w:rPr>
           <w:rFonts w:ascii="Arial" w:eastAsia="Arial" w:hAnsi="Arial" w:cs="Arial"/>
           <w:b/>
@@ -7073,52 +6939,42 @@
           <w:sz w:val="28"/>
           <w:szCs w:val="28"/>
         </w:rPr>
-        <w:t>ture Scope</w:t>
-      </w:r>
+      </w:pPr>
+      <w:r>
+        <w:rPr>
+          <w:rFonts w:ascii="Arial" w:eastAsia="Arial" w:hAnsi="Arial" w:cs="Arial"/>
+          <w:b/>
+          <w:bCs/>
+          <w:color w:val="0056B3"/>
+          <w:sz w:val="28"/>
+          <w:szCs w:val="28"/>
+        </w:rPr>
+        <w:t>GitHub Link</w:t>
+      </w:r>
+    </w:p>
+    <w:p>
+      <w:pPr>
+        <w:pStyle w:val="Heading1"/>
+        <w:spacing w:before="400" w:after="200"/>
+        <w:ind w:left="720"/>
+        <w:rPr>
+          <w:rFonts w:ascii="Arial" w:eastAsia="Arial" w:hAnsi="Arial" w:cs="Arial"/>
+          <w:color w:val="auto"/>
+          <w:sz w:val="24"/>
+          <w:szCs w:val="24"/>
+        </w:rPr>
+      </w:pPr>
+      <w:r>
+        <w:rPr>
+          <w:rFonts w:ascii="Arial" w:eastAsia="Arial" w:hAnsi="Arial" w:cs="Arial"/>
+          <w:color w:val="auto"/>
+          <w:sz w:val="24"/>
+          <w:szCs w:val="24"/>
+        </w:rPr>
+        <w:t>https://github.com/thezeeshanmehdi/ZMAH-Technologies---Full-Stack-E-Commerce-Store-Admin-CMS</w:t>
+      </w:r>
+      <w:bookmarkStart w:id="22" w:name="_GoBack"/>
       <w:bookmarkEnd w:id="22"/>
-    </w:p>
-    <w:p>
-      <w:pPr>
-        <w:spacing w:before="100" w:after="100"/>
-      </w:pPr>
-      <w:r>
-        <w:rPr>
-          <w:rFonts w:ascii="Arial" w:eastAsia="Arial" w:hAnsi="Arial" w:cs="Arial"/>
-          <w:color w:val="333333"/>
-          <w:sz w:val="22"/>
-          <w:szCs w:val="22"/>
-        </w:rPr>
-        <w:t>The project provides a stable, performant foundation for an e-commerce platform. Moving away from client-side UI frameworks ensures that pages load rapidly even on slower mobile networks. Future updates could implement automated email tracking l</w:t>
-      </w:r>
-      <w:r>
-        <w:rPr>
-          <w:rFonts w:ascii="Arial" w:eastAsia="Arial" w:hAnsi="Arial" w:cs="Arial"/>
-          <w:color w:val="333333"/>
-          <w:sz w:val="22"/>
-          <w:szCs w:val="22"/>
-        </w:rPr>
-        <w:t>inks, credit card payment integration (e.g., Stripe/</w:t>
-      </w:r>
-      <w:proofErr w:type="spellStart"/>
-      <w:r>
-        <w:rPr>
-          <w:rFonts w:ascii="Arial" w:eastAsia="Arial" w:hAnsi="Arial" w:cs="Arial"/>
-          <w:color w:val="333333"/>
-          <w:sz w:val="22"/>
-          <w:szCs w:val="22"/>
-        </w:rPr>
-        <w:t>EasyPaisa</w:t>
-      </w:r>
-      <w:proofErr w:type="spellEnd"/>
-      <w:r>
-        <w:rPr>
-          <w:rFonts w:ascii="Arial" w:eastAsia="Arial" w:hAnsi="Arial" w:cs="Arial"/>
-          <w:color w:val="333333"/>
-          <w:sz w:val="22"/>
-          <w:szCs w:val="22"/>
-        </w:rPr>
-        <w:t>), and advanced admin notifications for out-of-stock items.</w:t>
-      </w:r>
     </w:p>
     <w:sectPr>
       <w:pgSz w:w="11906" w:h="16838"/>
@@ -7279,7 +7135,7 @@
         <w:noProof/>
         <w:color w:val="5B9BD5" w:themeColor="accent1"/>
       </w:rPr>
-      <w:t>2</w:t>
+      <w:t>16</w:t>
     </w:r>
     <w:r>
       <w:rPr>
@@ -8524,526 +8380,6 @@
 </w:styles>
 </file>
 
-<file path=word/glossary/document.xml><?xml version="1.0" encoding="utf-8"?>
-<w:glossaryDocument xmlns:wpc="http://schemas.microsoft.com/office/word/2010/wordprocessingCanvas" xmlns:cx="http://schemas.microsoft.com/office/drawing/2014/chartex" xmlns:mc="http://schemas.openxmlformats.org/markup-compatibility/2006" xmlns:o="urn:schemas-microsoft-com:office:office" xmlns:r="http://schemas.openxmlformats.org/officeDocument/2006/relationships" xmlns:m="http://schemas.openxmlformats.org/officeDocument/2006/math" xmlns:v="urn:schemas-microsoft-com:vml" xmlns:wp14="http://schemas.microsoft.com/office/word/2010/wordprocessingDrawing" xmlns:wp="http://schemas.openxmlformats.org/drawingml/2006/wordprocessingDrawing" xmlns:w10="urn:schemas-microsoft-com:office:word" xmlns:w="http://schemas.openxmlformats.org/wordprocessingml/2006/main" xmlns:w14="http://schemas.microsoft.com/office/word/2010/wordml" xmlns:w15="http://schemas.microsoft.com/office/word/2012/wordml" xmlns:w16se="http://schemas.microsoft.com/office/word/2015/wordml/symex" xmlns:wpg="http://schemas.microsoft.com/office/word/2010/wordprocessingGroup" xmlns:wpi="http://schemas.microsoft.com/office/word/2010/wordprocessingInk" xmlns:wne="http://schemas.microsoft.com/office/word/2006/wordml" xmlns:wps="http://schemas.microsoft.com/office/word/2010/wordprocessingShape" mc:Ignorable="w14 w15 w16se wp14"/>
-</file>
-
-<file path=word/glossary/fontTable.xml><?xml version="1.0" encoding="utf-8"?>
-<w:fonts xmlns:mc="http://schemas.openxmlformats.org/markup-compatibility/2006" xmlns:r="http://schemas.openxmlformats.org/officeDocument/2006/relationships" xmlns:w="http://schemas.openxmlformats.org/wordprocessingml/2006/main" xmlns:w14="http://schemas.microsoft.com/office/word/2010/wordml" xmlns:w15="http://schemas.microsoft.com/office/word/2012/wordml" xmlns:w16se="http://schemas.microsoft.com/office/word/2015/wordml/symex" mc:Ignorable="w14 w15 w16se">
-  <w:font w:name="Times New Roman">
-    <w:panose1 w:val="02020603050405020304"/>
-    <w:charset w:val="00"/>
-    <w:family w:val="roman"/>
-    <w:pitch w:val="variable"/>
-    <w:sig w:usb0="E0002AFF" w:usb1="C0007843" w:usb2="00000009" w:usb3="00000000" w:csb0="000001FF" w:csb1="00000000"/>
-  </w:font>
-  <w:font w:name="Arial">
-    <w:altName w:val="Arial"/>
-    <w:panose1 w:val="020B0604020202020204"/>
-    <w:charset w:val="00"/>
-    <w:family w:val="swiss"/>
-    <w:pitch w:val="variable"/>
-    <w:sig w:usb0="E0002AFF" w:usb1="C0007843" w:usb2="00000009" w:usb3="00000000" w:csb0="000001FF" w:csb1="00000000"/>
-  </w:font>
-  <w:font w:name="Calibri Light">
-    <w:panose1 w:val="020F0302020204030204"/>
-    <w:charset w:val="00"/>
-    <w:family w:val="swiss"/>
-    <w:pitch w:val="variable"/>
-    <w:sig w:usb0="A0002AEF" w:usb1="4000207B" w:usb2="00000000" w:usb3="00000000" w:csb0="000001FF" w:csb1="00000000"/>
-  </w:font>
-  <w:font w:name="Calibri">
-    <w:panose1 w:val="020F0502020204030204"/>
-    <w:charset w:val="00"/>
-    <w:family w:val="swiss"/>
-    <w:pitch w:val="variable"/>
-    <w:sig w:usb0="E0002AFF" w:usb1="4000ACFF" w:usb2="00000001" w:usb3="00000000" w:csb0="000001FF" w:csb1="00000000"/>
-  </w:font>
-</w:fonts>
-</file>
-
-<file path=word/glossary/settings.xml><?xml version="1.0" encoding="utf-8"?>
-<w:settings xmlns:mc="http://schemas.openxmlformats.org/markup-compatibility/2006" xmlns:o="urn:schemas-microsoft-com:office:office" xmlns:r="http://schemas.openxmlformats.org/officeDocument/2006/relationships" xmlns:m="http://schemas.openxmlformats.org/officeDocument/2006/math" xmlns:v="urn:schemas-microsoft-com:vml" xmlns:w10="urn:schemas-microsoft-com:office:word" xmlns:w="http://schemas.openxmlformats.org/wordprocessingml/2006/main" xmlns:w14="http://schemas.microsoft.com/office/word/2010/wordml" xmlns:w15="http://schemas.microsoft.com/office/word/2012/wordml" xmlns:w16se="http://schemas.microsoft.com/office/word/2015/wordml/symex" xmlns:sl="http://schemas.openxmlformats.org/schemaLibrary/2006/main" mc:Ignorable="w14 w15 w16se">
-  <w:view w:val="normal"/>
-  <w:defaultTabStop w:val="720"/>
-  <w:characterSpacingControl w:val="doNotCompress"/>
-  <w:compat>
-    <w:useFELayout/>
-    <w:compatSetting w:name="compatibilityMode" w:uri="http://schemas.microsoft.com/office/word" w:val="15"/>
-    <w:compatSetting w:name="overrideTableStyleFontSizeAndJustification" w:uri="http://schemas.microsoft.com/office/word" w:val="1"/>
-    <w:compatSetting w:name="enableOpenTypeFeatures" w:uri="http://schemas.microsoft.com/office/word" w:val="1"/>
-    <w:compatSetting w:name="doNotFlipMirrorIndents" w:uri="http://schemas.microsoft.com/office/word" w:val="1"/>
-    <w:compatSetting w:name="differentiateMultirowTableHeaders" w:uri="http://schemas.microsoft.com/office/word" w:val="1"/>
-  </w:compat>
-  <w:rsids>
-    <w:rsidRoot w:val="00C116CA"/>
-    <w:rsid w:val="00750290"/>
-    <w:rsid w:val="00C116CA"/>
-  </w:rsids>
-  <m:mathPr>
-    <m:mathFont m:val="Cambria Math"/>
-    <m:brkBin m:val="before"/>
-    <m:brkBinSub m:val="--"/>
-    <m:smallFrac m:val="0"/>
-    <m:dispDef/>
-    <m:lMargin m:val="0"/>
-    <m:rMargin m:val="0"/>
-    <m:defJc m:val="centerGroup"/>
-    <m:wrapIndent m:val="1440"/>
-    <m:intLim m:val="subSup"/>
-    <m:naryLim m:val="undOvr"/>
-  </m:mathPr>
-  <w:themeFontLang w:val="en-GB" w:bidi="ar-SA"/>
-  <w:clrSchemeMapping w:bg1="light1" w:t1="dark1" w:bg2="light2" w:t2="dark2" w:accent1="accent1" w:accent2="accent2" w:accent3="accent3" w:accent4="accent4" w:accent5="accent5" w:accent6="accent6" w:hyperlink="hyperlink" w:followedHyperlink="followedHyperlink"/>
-  <w:decimalSymbol w:val="."/>
-  <w:listSeparator w:val=","/>
-  <w15:chartTrackingRefBased/>
-</w:settings>
-</file>
-
-<file path=word/glossary/styles.xml><?xml version="1.0" encoding="utf-8"?>
-<w:styles xmlns:mc="http://schemas.openxmlformats.org/markup-compatibility/2006" xmlns:r="http://schemas.openxmlformats.org/officeDocument/2006/relationships" xmlns:w="http://schemas.openxmlformats.org/wordprocessingml/2006/main" xmlns:w14="http://schemas.microsoft.com/office/word/2010/wordml" xmlns:w15="http://schemas.microsoft.com/office/word/2012/wordml" xmlns:w16se="http://schemas.microsoft.com/office/word/2015/wordml/symex" mc:Ignorable="w14 w15 w16se">
-  <w:docDefaults>
-    <w:rPrDefault>
-      <w:rPr>
-        <w:rFonts w:asciiTheme="minorHAnsi" w:eastAsiaTheme="minorEastAsia" w:hAnsiTheme="minorHAnsi" w:cstheme="minorBidi"/>
-        <w:sz w:val="22"/>
-        <w:szCs w:val="22"/>
-        <w:lang w:val="en-GB" w:eastAsia="en-GB" w:bidi="ar-SA"/>
-      </w:rPr>
-    </w:rPrDefault>
-    <w:pPrDefault>
-      <w:pPr>
-        <w:spacing w:after="160" w:line="259" w:lineRule="auto"/>
-      </w:pPr>
-    </w:pPrDefault>
-  </w:docDefaults>
-  <w:latentStyles w:defLockedState="0" w:defUIPriority="99" w:defSemiHidden="0" w:defUnhideWhenUsed="0" w:defQFormat="0" w:count="371">
-    <w:lsdException w:name="Normal" w:uiPriority="0" w:qFormat="1"/>
-    <w:lsdException w:name="heading 1" w:uiPriority="9" w:qFormat="1"/>
-    <w:lsdException w:name="heading 2" w:semiHidden="1" w:uiPriority="9" w:unhideWhenUsed="1" w:qFormat="1"/>
-    <w:lsdException w:name="heading 3" w:semiHidden="1" w:uiPriority="9" w:unhideWhenUsed="1" w:qFormat="1"/>
-    <w:lsdException w:name="heading 4" w:semiHidden="1" w:uiPriority="9" w:unhideWhenUsed="1" w:qFormat="1"/>
-    <w:lsdException w:name="heading 5" w:semiHidden="1" w:uiPriority="9" w:unhideWhenUsed="1" w:qFormat="1"/>
-    <w:lsdException w:name="heading 6" w:semiHidden="1" w:uiPriority="9" w:unhideWhenUsed="1" w:qFormat="1"/>
-    <w:lsdException w:name="heading 7" w:semiHidden="1" w:uiPriority="9" w:unhideWhenUsed="1" w:qFormat="1"/>
-    <w:lsdException w:name="heading 8" w:semiHidden="1" w:uiPriority="9" w:unhideWhenUsed="1" w:qFormat="1"/>
-    <w:lsdException w:name="heading 9" w:semiHidden="1" w:uiPriority="9" w:unhideWhenUsed="1" w:qFormat="1"/>
-    <w:lsdException w:name="index 1" w:semiHidden="1" w:unhideWhenUsed="1"/>
-    <w:lsdException w:name="index 2" w:semiHidden="1" w:unhideWhenUsed="1"/>
-    <w:lsdException w:name="index 3" w:semiHidden="1" w:unhideWhenUsed="1"/>
-    <w:lsdException w:name="index 4" w:semiHidden="1" w:unhideWhenUsed="1"/>
-    <w:lsdException w:name="index 5" w:semiHidden="1" w:unhideWhenUsed="1"/>
-    <w:lsdException w:name="index 6" w:semiHidden="1" w:unhideWhenUsed="1"/>
-    <w:lsdException w:name="index 7" w:semiHidden="1" w:unhideWhenUsed="1"/>
-    <w:lsdException w:name="index 8" w:semiHidden="1" w:unhideWhenUsed="1"/>
-    <w:lsdException w:name="index 9" w:semiHidden="1" w:unhideWhenUsed="1"/>
-    <w:lsdException w:name="toc 1" w:semiHidden="1" w:uiPriority="39" w:unhideWhenUsed="1"/>
-    <w:lsdException w:name="toc 2" w:semiHidden="1" w:uiPriority="39" w:unhideWhenUsed="1"/>
-    <w:lsdException w:name="toc 3" w:semiHidden="1" w:uiPriority="39" w:unhideWhenUsed="1"/>
-    <w:lsdException w:name="toc 4" w:semiHidden="1" w:uiPriority="39" w:unhideWhenUsed="1"/>
-    <w:lsdException w:name="toc 5" w:semiHidden="1" w:uiPriority="39" w:unhideWhenUsed="1"/>
-    <w:lsdException w:name="toc 6" w:semiHidden="1" w:uiPriority="39" w:unhideWhenUsed="1"/>
-    <w:lsdException w:name="toc 7" w:semiHidden="1" w:uiPriority="39" w:unhideWhenUsed="1"/>
-    <w:lsdException w:name="toc 8" w:semiHidden="1" w:uiPriority="39" w:unhideWhenUsed="1"/>
-    <w:lsdException w:name="toc 9" w:semiHidden="1" w:uiPriority="39" w:unhideWhenUsed="1"/>
-    <w:lsdException w:name="Normal Indent" w:semiHidden="1" w:unhideWhenUsed="1"/>
-    <w:lsdException w:name="footnote text" w:semiHidden="1" w:unhideWhenUsed="1"/>
-    <w:lsdException w:name="annotation text" w:semiHidden="1" w:unhideWhenUsed="1"/>
-    <w:lsdException w:name="header" w:semiHidden="1" w:unhideWhenUsed="1"/>
-    <w:lsdException w:name="footer" w:semiHidden="1" w:unhideWhenUsed="1"/>
-    <w:lsdException w:name="index heading" w:semiHidden="1" w:unhideWhenUsed="1"/>
-    <w:lsdException w:name="caption" w:semiHidden="1" w:uiPriority="35" w:unhideWhenUsed="1" w:qFormat="1"/>
-    <w:lsdException w:name="table of figures" w:semiHidden="1" w:unhideWhenUsed="1"/>
-    <w:lsdException w:name="envelope address" w:semiHidden="1" w:unhideWhenUsed="1"/>
-    <w:lsdException w:name="envelope return" w:semiHidden="1" w:unhideWhenUsed="1"/>
-    <w:lsdException w:name="footnote reference" w:semiHidden="1" w:unhideWhenUsed="1"/>
-    <w:lsdException w:name="annotation reference" w:semiHidden="1" w:unhideWhenUsed="1"/>
-    <w:lsdException w:name="line number" w:semiHidden="1" w:unhideWhenUsed="1"/>
-    <w:lsdException w:name="page number" w:semiHidden="1" w:unhideWhenUsed="1"/>
-    <w:lsdException w:name="endnote reference" w:semiHidden="1" w:unhideWhenUsed="1"/>
-    <w:lsdException w:name="endnote text" w:semiHidden="1" w:unhideWhenUsed="1"/>
-    <w:lsdException w:name="table of authorities" w:semiHidden="1" w:unhideWhenUsed="1"/>
-    <w:lsdException w:name="macro" w:semiHidden="1" w:unhideWhenUsed="1"/>
-    <w:lsdException w:name="toa heading" w:semiHidden="1" w:unhideWhenUsed="1"/>
-    <w:lsdException w:name="List" w:semiHidden="1" w:unhideWhenUsed="1"/>
-    <w:lsdException w:name="List Bullet" w:semiHidden="1" w:unhideWhenUsed="1"/>
-    <w:lsdException w:name="List Number" w:semiHidden="1" w:unhideWhenUsed="1"/>
-    <w:lsdException w:name="List 2" w:semiHidden="1" w:unhideWhenUsed="1"/>
-    <w:lsdException w:name="List 3" w:semiHidden="1" w:unhideWhenUsed="1"/>
-    <w:lsdException w:name="List 4" w:semiHidden="1" w:unhideWhenUsed="1"/>
-    <w:lsdException w:name="List 5" w:semiHidden="1" w:unhideWhenUsed="1"/>
-    <w:lsdException w:name="List Bullet 2" w:semiHidden="1" w:unhideWhenUsed="1"/>
-    <w:lsdException w:name="List Bullet 3" w:semiHidden="1" w:unhideWhenUsed="1"/>
-    <w:lsdException w:name="List Bullet 4" w:semiHidden="1" w:unhideWhenUsed="1"/>
-    <w:lsdException w:name="List Bullet 5" w:semiHidden="1" w:unhideWhenUsed="1"/>
-    <w:lsdException w:name="List Number 2" w:semiHidden="1" w:unhideWhenUsed="1"/>
-    <w:lsdException w:name="List Number 3" w:semiHidden="1" w:unhideWhenUsed="1"/>
-    <w:lsdException w:name="List Number 4" w:semiHidden="1" w:unhideWhenUsed="1"/>
-    <w:lsdException w:name="List Number 5" w:semiHidden="1" w:unhideWhenUsed="1"/>
-    <w:lsdException w:name="Title" w:uiPriority="10" w:qFormat="1"/>
-    <w:lsdException w:name="Closing" w:semiHidden="1" w:unhideWhenUsed="1"/>
-    <w:lsdException w:name="Signature" w:semiHidden="1" w:unhideWhenUsed="1"/>
-    <w:lsdException w:name="Default Paragraph Font" w:semiHidden="1" w:uiPriority="1" w:unhideWhenUsed="1"/>
-    <w:lsdException w:name="Body Text" w:semiHidden="1" w:unhideWhenUsed="1"/>
-    <w:lsdException w:name="Body Text Indent" w:semiHidden="1" w:unhideWhenUsed="1"/>
-    <w:lsdException w:name="List Continue" w:semiHidden="1" w:unhideWhenUsed="1"/>
-    <w:lsdException w:name="List Continue 2" w:semiHidden="1" w:unhideWhenUsed="1"/>
-    <w:lsdException w:name="List Continue 3" w:semiHidden="1" w:unhideWhenUsed="1"/>
-    <w:lsdException w:name="List Continue 4" w:semiHidden="1" w:unhideWhenUsed="1"/>
-    <w:lsdException w:name="List Continue 5" w:semiHidden="1" w:unhideWhenUsed="1"/>
-    <w:lsdException w:name="Message Header" w:semiHidden="1" w:unhideWhenUsed="1"/>
-    <w:lsdException w:name="Subtitle" w:uiPriority="11" w:qFormat="1"/>
-    <w:lsdException w:name="Salutation" w:semiHidden="1" w:unhideWhenUsed="1"/>
-    <w:lsdException w:name="Date" w:semiHidden="1" w:unhideWhenUsed="1"/>
-    <w:lsdException w:name="Body Text First Indent" w:semiHidden="1" w:unhideWhenUsed="1"/>
-    <w:lsdException w:name="Body Text First Indent 2" w:semiHidden="1" w:unhideWhenUsed="1"/>
-    <w:lsdException w:name="Note Heading" w:semiHidden="1" w:unhideWhenUsed="1"/>
-    <w:lsdException w:name="Body Text 2" w:semiHidden="1" w:unhideWhenUsed="1"/>
-    <w:lsdException w:name="Body Text 3" w:semiHidden="1" w:unhideWhenUsed="1"/>
-    <w:lsdException w:name="Body Text Indent 2" w:semiHidden="1" w:unhideWhenUsed="1"/>
-    <w:lsdException w:name="Body Text Indent 3" w:semiHidden="1" w:unhideWhenUsed="1"/>
-    <w:lsdException w:name="Block Text" w:semiHidden="1" w:unhideWhenUsed="1"/>
-    <w:lsdException w:name="Hyperlink" w:semiHidden="1" w:unhideWhenUsed="1"/>
-    <w:lsdException w:name="FollowedHyperlink" w:semiHidden="1" w:unhideWhenUsed="1"/>
-    <w:lsdException w:name="Strong" w:uiPriority="22" w:qFormat="1"/>
-    <w:lsdException w:name="Emphasis" w:uiPriority="20" w:qFormat="1"/>
-    <w:lsdException w:name="Document Map" w:semiHidden="1" w:unhideWhenUsed="1"/>
-    <w:lsdException w:name="Plain Text" w:semiHidden="1" w:unhideWhenUsed="1"/>
-    <w:lsdException w:name="E-mail Signature" w:semiHidden="1" w:unhideWhenUsed="1"/>
-    <w:lsdException w:name="HTML Top of Form" w:semiHidden="1" w:unhideWhenUsed="1"/>
-    <w:lsdException w:name="HTML Bottom of Form" w:semiHidden="1" w:unhideWhenUsed="1"/>
-    <w:lsdException w:name="Normal (Web)" w:semiHidden="1" w:unhideWhenUsed="1"/>
-    <w:lsdException w:name="HTML Acronym" w:semiHidden="1" w:unhideWhenUsed="1"/>
-    <w:lsdException w:name="HTML Address" w:semiHidden="1" w:unhideWhenUsed="1"/>
-    <w:lsdException w:name="HTML Cite" w:semiHidden="1" w:unhideWhenUsed="1"/>
-    <w:lsdException w:name="HTML Code" w:semiHidden="1" w:unhideWhenUsed="1"/>
-    <w:lsdException w:name="HTML Definition" w:semiHidden="1" w:unhideWhenUsed="1"/>
-    <w:lsdException w:name="HTML Keyboard" w:semiHidden="1" w:unhideWhenUsed="1"/>
-    <w:lsdException w:name="HTML Preformatted" w:semiHidden="1" w:unhideWhenUsed="1"/>
-    <w:lsdException w:name="HTML Sample" w:semiHidden="1" w:unhideWhenUsed="1"/>
-    <w:lsdException w:name="HTML Typewriter" w:semiHidden="1" w:unhideWhenUsed="1"/>
-    <w:lsdException w:name="HTML Variable" w:semiHidden="1" w:unhideWhenUsed="1"/>
-    <w:lsdException w:name="Normal Table" w:semiHidden="1" w:unhideWhenUsed="1"/>
-    <w:lsdException w:name="annotation subject" w:semiHidden="1" w:unhideWhenUsed="1"/>
-    <w:lsdException w:name="No List" w:semiHidden="1" w:unhideWhenUsed="1"/>
-    <w:lsdException w:name="Outline List 1" w:semiHidden="1" w:unhideWhenUsed="1"/>
-    <w:lsdException w:name="Outline List 2" w:semiHidden="1" w:unhideWhenUsed="1"/>
-    <w:lsdException w:name="Outline List 3" w:semiHidden="1" w:unhideWhenUsed="1"/>
-    <w:lsdException w:name="Table Simple 1" w:semiHidden="1" w:unhideWhenUsed="1"/>
-    <w:lsdException w:name="Table Simple 2" w:semiHidden="1" w:unhideWhenUsed="1"/>
-    <w:lsdException w:name="Table Simple 3" w:semiHidden="1" w:unhideWhenUsed="1"/>
-    <w:lsdException w:name="Table Classic 1" w:semiHidden="1" w:unhideWhenUsed="1"/>
-    <w:lsdException w:name="Table Classic 2" w:semiHidden="1" w:unhideWhenUsed="1"/>
-    <w:lsdException w:name="Table Classic 3" w:semiHidden="1" w:unhideWhenUsed="1"/>
-    <w:lsdException w:name="Table Classic 4" w:semiHidden="1" w:unhideWhenUsed="1"/>
-    <w:lsdException w:name="Table Colorful 1" w:semiHidden="1" w:unhideWhenUsed="1"/>
-    <w:lsdException w:name="Table Colorful 2" w:semiHidden="1" w:unhideWhenUsed="1"/>
-    <w:lsdException w:name="Table Colorful 3" w:semiHidden="1" w:unhideWhenUsed="1"/>
-    <w:lsdException w:name="Table Columns 1" w:semiHidden="1" w:unhideWhenUsed="1"/>
-    <w:lsdException w:name="Table Columns 2" w:semiHidden="1" w:unhideWhenUsed="1"/>
-    <w:lsdException w:name="Table Columns 3" w:semiHidden="1" w:unhideWhenUsed="1"/>
-    <w:lsdException w:name="Table Columns 4" w:semiHidden="1" w:unhideWhenUsed="1"/>
-    <w:lsdException w:name="Table Columns 5" w:semiHidden="1" w:unhideWhenUsed="1"/>
-    <w:lsdException w:name="Table Grid 1" w:semiHidden="1" w:unhideWhenUsed="1"/>
-    <w:lsdException w:name="Table Grid 2" w:semiHidden="1" w:unhideWhenUsed="1"/>
-    <w:lsdException w:name="Table Grid 3" w:semiHidden="1" w:unhideWhenUsed="1"/>
-    <w:lsdException w:name="Table Grid 4" w:semiHidden="1" w:unhideWhenUsed="1"/>
-    <w:lsdException w:name="Table Grid 5" w:semiHidden="1" w:unhideWhenUsed="1"/>
-    <w:lsdException w:name="Table Grid 6" w:semiHidden="1" w:unhideWhenUsed="1"/>
-    <w:lsdException w:name="Table Grid 7" w:semiHidden="1" w:unhideWhenUsed="1"/>
-    <w:lsdException w:name="Table Grid 8" w:semiHidden="1" w:unhideWhenUsed="1"/>
-    <w:lsdException w:name="Table List 1" w:semiHidden="1" w:unhideWhenUsed="1"/>
-    <w:lsdException w:name="Table List 2" w:semiHidden="1" w:unhideWhenUsed="1"/>
-    <w:lsdException w:name="Table List 3" w:semiHidden="1" w:unhideWhenUsed="1"/>
-    <w:lsdException w:name="Table List 4" w:semiHidden="1" w:unhideWhenUsed="1"/>
-    <w:lsdException w:name="Table List 5" w:semiHidden="1" w:unhideWhenUsed="1"/>
-    <w:lsdException w:name="Table List 6" w:semiHidden="1" w:unhideWhenUsed="1"/>
-    <w:lsdException w:name="Table List 7" w:semiHidden="1" w:unhideWhenUsed="1"/>
-    <w:lsdException w:name="Table List 8" w:semiHidden="1" w:unhideWhenUsed="1"/>
-    <w:lsdException w:name="Table 3D effects 1" w:semiHidden="1" w:unhideWhenUsed="1"/>
-    <w:lsdException w:name="Table 3D effects 2" w:semiHidden="1" w:unhideWhenUsed="1"/>
-    <w:lsdException w:name="Table 3D effects 3" w:semiHidden="1" w:unhideWhenUsed="1"/>
-    <w:lsdException w:name="Table Contemporary" w:semiHidden="1" w:unhideWhenUsed="1"/>
-    <w:lsdException w:name="Table Elegant" w:semiHidden="1" w:unhideWhenUsed="1"/>
-    <w:lsdException w:name="Table Professional" w:semiHidden="1" w:unhideWhenUsed="1"/>
-    <w:lsdException w:name="Table Subtle 1" w:semiHidden="1" w:unhideWhenUsed="1"/>
-    <w:lsdException w:name="Table Subtle 2" w:semiHidden="1" w:unhideWhenUsed="1"/>
-    <w:lsdException w:name="Table Web 1" w:semiHidden="1" w:unhideWhenUsed="1"/>
-    <w:lsdException w:name="Table Web 2" w:semiHidden="1" w:unhideWhenUsed="1"/>
-    <w:lsdException w:name="Table Web 3" w:semiHidden="1" w:unhideWhenUsed="1"/>
-    <w:lsdException w:name="Balloon Text" w:semiHidden="1" w:unhideWhenUsed="1"/>
-    <w:lsdException w:name="Table Grid" w:uiPriority="39"/>
-    <w:lsdException w:name="Table Theme" w:semiHidden="1" w:unhideWhenUsed="1"/>
-    <w:lsdException w:name="Placeholder Text" w:semiHidden="1"/>
-    <w:lsdException w:name="No Spacing" w:uiPriority="1" w:qFormat="1"/>
-    <w:lsdException w:name="Light Shading" w:uiPriority="60"/>
-    <w:lsdException w:name="Light List" w:uiPriority="61"/>
-    <w:lsdException w:name="Light Grid" w:uiPriority="62"/>
-    <w:lsdException w:name="Medium Shading 1" w:uiPriority="63"/>
-    <w:lsdException w:name="Medium Shading 2" w:uiPriority="64"/>
-    <w:lsdException w:name="Medium List 1" w:uiPriority="65"/>
-    <w:lsdException w:name="Medium List 2" w:uiPriority="66"/>
-    <w:lsdException w:name="Medium Grid 1" w:uiPriority="67"/>
-    <w:lsdException w:name="Medium Grid 2" w:uiPriority="68"/>
-    <w:lsdException w:name="Medium Grid 3" w:uiPriority="69"/>
-    <w:lsdException w:name="Dark List" w:uiPriority="70"/>
-    <w:lsdException w:name="Colorful Shading" w:uiPriority="71"/>
-    <w:lsdException w:name="Colorful List" w:uiPriority="72"/>
-    <w:lsdException w:name="Colorful Grid" w:uiPriority="73"/>
-    <w:lsdException w:name="Light Shading Accent 1" w:uiPriority="60"/>
-    <w:lsdException w:name="Light List Accent 1" w:uiPriority="61"/>
-    <w:lsdException w:name="Light Grid Accent 1" w:uiPriority="62"/>
-    <w:lsdException w:name="Medium Shading 1 Accent 1" w:uiPriority="63"/>
-    <w:lsdException w:name="Medium Shading 2 Accent 1" w:uiPriority="64"/>
-    <w:lsdException w:name="Medium List 1 Accent 1" w:uiPriority="65"/>
-    <w:lsdException w:name="Revision" w:semiHidden="1"/>
-    <w:lsdException w:name="List Paragraph" w:uiPriority="34" w:qFormat="1"/>
-    <w:lsdException w:name="Quote" w:uiPriority="29" w:qFormat="1"/>
-    <w:lsdException w:name="Intense Quote" w:uiPriority="30" w:qFormat="1"/>
-    <w:lsdException w:name="Medium List 2 Accent 1" w:uiPriority="66"/>
-    <w:lsdException w:name="Medium Grid 1 Accent 1" w:uiPriority="67"/>
-    <w:lsdException w:name="Medium Grid 2 Accent 1" w:uiPriority="68"/>
-    <w:lsdException w:name="Medium Grid 3 Accent 1" w:uiPriority="69"/>
-    <w:lsdException w:name="Dark List Accent 1" w:uiPriority="70"/>
-    <w:lsdException w:name="Colorful Shading Accent 1" w:uiPriority="71"/>
-    <w:lsdException w:name="Colorful List Accent 1" w:uiPriority="72"/>
-    <w:lsdException w:name="Colorful Grid Accent 1" w:uiPriority="73"/>
-    <w:lsdException w:name="Light Shading Accent 2" w:uiPriority="60"/>
-    <w:lsdException w:name="Light List Accent 2" w:uiPriority="61"/>
-    <w:lsdException w:name="Light Grid Accent 2" w:uiPriority="62"/>
-    <w:lsdException w:name="Medium Shading 1 Accent 2" w:uiPriority="63"/>
-    <w:lsdException w:name="Medium Shading 2 Accent 2" w:uiPriority="64"/>
-    <w:lsdException w:name="Medium List 1 Accent 2" w:uiPriority="65"/>
-    <w:lsdException w:name="Medium List 2 Accent 2" w:uiPriority="66"/>
-    <w:lsdException w:name="Medium Grid 1 Accent 2" w:uiPriority="67"/>
-    <w:lsdException w:name="Medium Grid 2 Accent 2" w:uiPriority="68"/>
-    <w:lsdException w:name="Medium Grid 3 Accent 2" w:uiPriority="69"/>
-    <w:lsdException w:name="Dark List Accent 2" w:uiPriority="70"/>
-    <w:lsdException w:name="Colorful Shading Accent 2" w:uiPriority="71"/>
-    <w:lsdException w:name="Colorful List Accent 2" w:uiPriority="72"/>
-    <w:lsdException w:name="Colorful Grid Accent 2" w:uiPriority="73"/>
-    <w:lsdException w:name="Light Shading Accent 3" w:uiPriority="60"/>
-    <w:lsdException w:name="Light List Accent 3" w:uiPriority="61"/>
-    <w:lsdException w:name="Light Grid Accent 3" w:uiPriority="62"/>
-    <w:lsdException w:name="Medium Shading 1 Accent 3" w:uiPriority="63"/>
-    <w:lsdException w:name="Medium Shading 2 Accent 3" w:uiPriority="64"/>
-    <w:lsdException w:name="Medium List 1 Accent 3" w:uiPriority="65"/>
-    <w:lsdException w:name="Medium List 2 Accent 3" w:uiPriority="66"/>
-    <w:lsdException w:name="Medium Grid 1 Accent 3" w:uiPriority="67"/>
-    <w:lsdException w:name="Medium Grid 2 Accent 3" w:uiPriority="68"/>
-    <w:lsdException w:name="Medium Grid 3 Accent 3" w:uiPriority="69"/>
-    <w:lsdException w:name="Dark List Accent 3" w:uiPriority="70"/>
-    <w:lsdException w:name="Colorful Shading Accent 3" w:uiPriority="71"/>
-    <w:lsdException w:name="Colorful List Accent 3" w:uiPriority="72"/>
-    <w:lsdException w:name="Colorful Grid Accent 3" w:uiPriority="73"/>
-    <w:lsdException w:name="Light Shading Accent 4" w:uiPriority="60"/>
-    <w:lsdException w:name="Light List Accent 4" w:uiPriority="61"/>
-    <w:lsdException w:name="Light Grid Accent 4" w:uiPriority="62"/>
-    <w:lsdException w:name="Medium Shading 1 Accent 4" w:uiPriority="63"/>
-    <w:lsdException w:name="Medium Shading 2 Accent 4" w:uiPriority="64"/>
-    <w:lsdException w:name="Medium List 1 Accent 4" w:uiPriority="65"/>
-    <w:lsdException w:name="Medium List 2 Accent 4" w:uiPriority="66"/>
-    <w:lsdException w:name="Medium Grid 1 Accent 4" w:uiPriority="67"/>
-    <w:lsdException w:name="Medium Grid 2 Accent 4" w:uiPriority="68"/>
-    <w:lsdException w:name="Medium Grid 3 Accent 4" w:uiPriority="69"/>
-    <w:lsdException w:name="Dark List Accent 4" w:uiPriority="70"/>
-    <w:lsdException w:name="Colorful Shading Accent 4" w:uiPriority="71"/>
-    <w:lsdException w:name="Colorful List Accent 4" w:uiPriority="72"/>
-    <w:lsdException w:name="Colorful Grid Accent 4" w:uiPriority="73"/>
-    <w:lsdException w:name="Light Shading Accent 5" w:uiPriority="60"/>
-    <w:lsdException w:name="Light List Accent 5" w:uiPriority="61"/>
-    <w:lsdException w:name="Light Grid Accent 5" w:uiPriority="62"/>
-    <w:lsdException w:name="Medium Shading 1 Accent 5" w:uiPriority="63"/>
-    <w:lsdException w:name="Medium Shading 2 Accent 5" w:uiPriority="64"/>
-    <w:lsdException w:name="Medium List 1 Accent 5" w:uiPriority="65"/>
-    <w:lsdException w:name="Medium List 2 Accent 5" w:uiPriority="66"/>
-    <w:lsdException w:name="Medium Grid 1 Accent 5" w:uiPriority="67"/>
-    <w:lsdException w:name="Medium Grid 2 Accent 5" w:uiPriority="68"/>
-    <w:lsdException w:name="Medium Grid 3 Accent 5" w:uiPriority="69"/>
-    <w:lsdException w:name="Dark List Accent 5" w:uiPriority="70"/>
-    <w:lsdException w:name="Colorful Shading Accent 5" w:uiPriority="71"/>
-    <w:lsdException w:name="Colorful List Accent 5" w:uiPriority="72"/>
-    <w:lsdException w:name="Colorful Grid Accent 5" w:uiPriority="73"/>
-    <w:lsdException w:name="Light Shading Accent 6" w:uiPriority="60"/>
-    <w:lsdException w:name="Light List Accent 6" w:uiPriority="61"/>
-    <w:lsdException w:name="Light Grid Accent 6" w:uiPriority="62"/>
-    <w:lsdException w:name="Medium Shading 1 Accent 6" w:uiPriority="63"/>
-    <w:lsdException w:name="Medium Shading 2 Accent 6" w:uiPriority="64"/>
-    <w:lsdException w:name="Medium List 1 Accent 6" w:uiPriority="65"/>
-    <w:lsdException w:name="Medium List 2 Accent 6" w:uiPriority="66"/>
-    <w:lsdException w:name="Medium Grid 1 Accent 6" w:uiPriority="67"/>
-    <w:lsdException w:name="Medium Grid 2 Accent 6" w:uiPriority="68"/>
-    <w:lsdException w:name="Medium Grid 3 Accent 6" w:uiPriority="69"/>
-    <w:lsdException w:name="Dark List Accent 6" w:uiPriority="70"/>
-    <w:lsdException w:name="Colorful Shading Accent 6" w:uiPriority="71"/>
-    <w:lsdException w:name="Colorful List Accent 6" w:uiPriority="72"/>
-    <w:lsdException w:name="Colorful Grid Accent 6" w:uiPriority="73"/>
-    <w:lsdException w:name="Subtle Emphasis" w:uiPriority="19" w:qFormat="1"/>
-    <w:lsdException w:name="Intense Emphasis" w:uiPriority="21" w:qFormat="1"/>
-    <w:lsdException w:name="Subtle Reference" w:uiPriority="31" w:qFormat="1"/>
-    <w:lsdException w:name="Intense Reference" w:uiPriority="32" w:qFormat="1"/>
-    <w:lsdException w:name="Book Title" w:uiPriority="33" w:qFormat="1"/>
-    <w:lsdException w:name="Bibliography" w:semiHidden="1" w:uiPriority="37" w:unhideWhenUsed="1"/>
-    <w:lsdException w:name="TOC Heading" w:semiHidden="1" w:uiPriority="39" w:unhideWhenUsed="1" w:qFormat="1"/>
-    <w:lsdException w:name="Plain Table 1" w:uiPriority="41"/>
-    <w:lsdException w:name="Plain Table 2" w:uiPriority="42"/>
-    <w:lsdException w:name="Plain Table 3" w:uiPriority="43"/>
-    <w:lsdException w:name="Plain Table 4" w:uiPriority="44"/>
-    <w:lsdException w:name="Plain Table 5" w:uiPriority="45"/>
-    <w:lsdException w:name="Grid Table Light" w:uiPriority="40"/>
-    <w:lsdException w:name="Grid Table 1 Light" w:uiPriority="46"/>
-    <w:lsdException w:name="Grid Table 2" w:uiPriority="47"/>
-    <w:lsdException w:name="Grid Table 3" w:uiPriority="48"/>
-    <w:lsdException w:name="Grid Table 4" w:uiPriority="49"/>
-    <w:lsdException w:name="Grid Table 5 Dark" w:uiPriority="50"/>
-    <w:lsdException w:name="Grid Table 6 Colorful" w:uiPriority="51"/>
-    <w:lsdException w:name="Grid Table 7 Colorful" w:uiPriority="52"/>
-    <w:lsdException w:name="Grid Table 1 Light Accent 1" w:uiPriority="46"/>
-    <w:lsdException w:name="Grid Table 2 Accent 1" w:uiPriority="47"/>
-    <w:lsdException w:name="Grid Table 3 Accent 1" w:uiPriority="48"/>
-    <w:lsdException w:name="Grid Table 4 Accent 1" w:uiPriority="49"/>
-    <w:lsdException w:name="Grid Table 5 Dark Accent 1" w:uiPriority="50"/>
-    <w:lsdException w:name="Grid Table 6 Colorful Accent 1" w:uiPriority="51"/>
-    <w:lsdException w:name="Grid Table 7 Colorful Accent 1" w:uiPriority="52"/>
-    <w:lsdException w:name="Grid Table 1 Light Accent 2" w:uiPriority="46"/>
-    <w:lsdException w:name="Grid Table 2 Accent 2" w:uiPriority="47"/>
-    <w:lsdException w:name="Grid Table 3 Accent 2" w:uiPriority="48"/>
-    <w:lsdException w:name="Grid Table 4 Accent 2" w:uiPriority="49"/>
-    <w:lsdException w:name="Grid Table 5 Dark Accent 2" w:uiPriority="50"/>
-    <w:lsdException w:name="Grid Table 6 Colorful Accent 2" w:uiPriority="51"/>
-    <w:lsdException w:name="Grid Table 7 Colorful Accent 2" w:uiPriority="52"/>
-    <w:lsdException w:name="Grid Table 1 Light Accent 3" w:uiPriority="46"/>
-    <w:lsdException w:name="Grid Table 2 Accent 3" w:uiPriority="47"/>
-    <w:lsdException w:name="Grid Table 3 Accent 3" w:uiPriority="48"/>
-    <w:lsdException w:name="Grid Table 4 Accent 3" w:uiPriority="49"/>
-    <w:lsdException w:name="Grid Table 5 Dark Accent 3" w:uiPriority="50"/>
-    <w:lsdException w:name="Grid Table 6 Colorful Accent 3" w:uiPriority="51"/>
-    <w:lsdException w:name="Grid Table 7 Colorful Accent 3" w:uiPriority="52"/>
-    <w:lsdException w:name="Grid Table 1 Light Accent 4" w:uiPriority="46"/>
-    <w:lsdException w:name="Grid Table 2 Accent 4" w:uiPriority="47"/>
-    <w:lsdException w:name="Grid Table 3 Accent 4" w:uiPriority="48"/>
-    <w:lsdException w:name="Grid Table 4 Accent 4" w:uiPriority="49"/>
-    <w:lsdException w:name="Grid Table 5 Dark Accent 4" w:uiPriority="50"/>
-    <w:lsdException w:name="Grid Table 6 Colorful Accent 4" w:uiPriority="51"/>
-    <w:lsdException w:name="Grid Table 7 Colorful Accent 4" w:uiPriority="52"/>
-    <w:lsdException w:name="Grid Table 1 Light Accent 5" w:uiPriority="46"/>
-    <w:lsdException w:name="Grid Table 2 Accent 5" w:uiPriority="47"/>
-    <w:lsdException w:name="Grid Table 3 Accent 5" w:uiPriority="48"/>
-    <w:lsdException w:name="Grid Table 4 Accent 5" w:uiPriority="49"/>
-    <w:lsdException w:name="Grid Table 5 Dark Accent 5" w:uiPriority="50"/>
-    <w:lsdException w:name="Grid Table 6 Colorful Accent 5" w:uiPriority="51"/>
-    <w:lsdException w:name="Grid Table 7 Colorful Accent 5" w:uiPriority="52"/>
-    <w:lsdException w:name="Grid Table 1 Light Accent 6" w:uiPriority="46"/>
-    <w:lsdException w:name="Grid Table 2 Accent 6" w:uiPriority="47"/>
-    <w:lsdException w:name="Grid Table 3 Accent 6" w:uiPriority="48"/>
-    <w:lsdException w:name="Grid Table 4 Accent 6" w:uiPriority="49"/>
-    <w:lsdException w:name="Grid Table 5 Dark Accent 6" w:uiPriority="50"/>
-    <w:lsdException w:name="Grid Table 6 Colorful Accent 6" w:uiPriority="51"/>
-    <w:lsdException w:name="Grid Table 7 Colorful Accent 6" w:uiPriority="52"/>
-    <w:lsdException w:name="List Table 1 Light" w:uiPriority="46"/>
-    <w:lsdException w:name="List Table 2" w:uiPriority="47"/>
-    <w:lsdException w:name="List Table 3" w:uiPriority="48"/>
-    <w:lsdException w:name="List Table 4" w:uiPriority="49"/>
-    <w:lsdException w:name="List Table 5 Dark" w:uiPriority="50"/>
-    <w:lsdException w:name="List Table 6 Colorful" w:uiPriority="51"/>
-    <w:lsdException w:name="List Table 7 Colorful" w:uiPriority="52"/>
-    <w:lsdException w:name="List Table 1 Light Accent 1" w:uiPriority="46"/>
-    <w:lsdException w:name="List Table 2 Accent 1" w:uiPriority="47"/>
-    <w:lsdException w:name="List Table 3 Accent 1" w:uiPriority="48"/>
-    <w:lsdException w:name="List Table 4 Accent 1" w:uiPriority="49"/>
-    <w:lsdException w:name="List Table 5 Dark Accent 1" w:uiPriority="50"/>
-    <w:lsdException w:name="List Table 6 Colorful Accent 1" w:uiPriority="51"/>
-    <w:lsdException w:name="List Table 7 Colorful Accent 1" w:uiPriority="52"/>
-    <w:lsdException w:name="List Table 1 Light Accent 2" w:uiPriority="46"/>
-    <w:lsdException w:name="List Table 2 Accent 2" w:uiPriority="47"/>
-    <w:lsdException w:name="List Table 3 Accent 2" w:uiPriority="48"/>
-    <w:lsdException w:name="List Table 4 Accent 2" w:uiPriority="49"/>
-    <w:lsdException w:name="List Table 5 Dark Accent 2" w:uiPriority="50"/>
-    <w:lsdException w:name="List Table 6 Colorful Accent 2" w:uiPriority="51"/>
-    <w:lsdException w:name="List Table 7 Colorful Accent 2" w:uiPriority="52"/>
-    <w:lsdException w:name="List Table 1 Light Accent 3" w:uiPriority="46"/>
-    <w:lsdException w:name="List Table 2 Accent 3" w:uiPriority="47"/>
-    <w:lsdException w:name="List Table 3 Accent 3" w:uiPriority="48"/>
-    <w:lsdException w:name="List Table 4 Accent 3" w:uiPriority="49"/>
-    <w:lsdException w:name="List Table 5 Dark Accent 3" w:uiPriority="50"/>
-    <w:lsdException w:name="List Table 6 Colorful Accent 3" w:uiPriority="51"/>
-    <w:lsdException w:name="List Table 7 Colorful Accent 3" w:uiPriority="52"/>
-    <w:lsdException w:name="List Table 1 Light Accent 4" w:uiPriority="46"/>
-    <w:lsdException w:name="List Table 2 Accent 4" w:uiPriority="47"/>
-    <w:lsdException w:name="List Table 3 Accent 4" w:uiPriority="48"/>
-    <w:lsdException w:name="List Table 4 Accent 4" w:uiPriority="49"/>
-    <w:lsdException w:name="List Table 5 Dark Accent 4" w:uiPriority="50"/>
-    <w:lsdException w:name="List Table 6 Colorful Accent 4" w:uiPriority="51"/>
-    <w:lsdException w:name="List Table 7 Colorful Accent 4" w:uiPriority="52"/>
-    <w:lsdException w:name="List Table 1 Light Accent 5" w:uiPriority="46"/>
-    <w:lsdException w:name="List Table 2 Accent 5" w:uiPriority="47"/>
-    <w:lsdException w:name="List Table 3 Accent 5" w:uiPriority="48"/>
-    <w:lsdException w:name="List Table 4 Accent 5" w:uiPriority="49"/>
-    <w:lsdException w:name="List Table 5 Dark Accent 5" w:uiPriority="50"/>
-    <w:lsdException w:name="List Table 6 Colorful Accent 5" w:uiPriority="51"/>
-    <w:lsdException w:name="List Table 7 Colorful Accent 5" w:uiPriority="52"/>
-    <w:lsdException w:name="List Table 1 Light Accent 6" w:uiPriority="46"/>
-    <w:lsdException w:name="List Table 2 Accent 6" w:uiPriority="47"/>
-    <w:lsdException w:name="List Table 3 Accent 6" w:uiPriority="48"/>
-    <w:lsdException w:name="List Table 4 Accent 6" w:uiPriority="49"/>
-    <w:lsdException w:name="List Table 5 Dark Accent 6" w:uiPriority="50"/>
-    <w:lsdException w:name="List Table 6 Colorful Accent 6" w:uiPriority="51"/>
-    <w:lsdException w:name="List Table 7 Colorful Accent 6" w:uiPriority="52"/>
-  </w:latentStyles>
-  <w:style w:type="paragraph" w:default="1" w:styleId="Normal">
-    <w:name w:val="Normal"/>
-    <w:qFormat/>
-  </w:style>
-  <w:style w:type="character" w:default="1" w:styleId="DefaultParagraphFont">
-    <w:name w:val="Default Paragraph Font"/>
-    <w:uiPriority w:val="1"/>
-    <w:semiHidden/>
-    <w:unhideWhenUsed/>
-  </w:style>
-  <w:style w:type="table" w:default="1" w:styleId="TableNormal">
-    <w:name w:val="Normal Table"/>
-    <w:uiPriority w:val="99"/>
-    <w:semiHidden/>
-    <w:unhideWhenUsed/>
-    <w:tblPr>
-      <w:tblInd w:w="0" w:type="dxa"/>
-      <w:tblCellMar>
-        <w:top w:w="0" w:type="dxa"/>
-        <w:left w:w="108" w:type="dxa"/>
-        <w:bottom w:w="0" w:type="dxa"/>
-        <w:right w:w="108" w:type="dxa"/>
-      </w:tblCellMar>
-    </w:tblPr>
-  </w:style>
-  <w:style w:type="numbering" w:default="1" w:styleId="NoList">
-    <w:name w:val="No List"/>
-    <w:uiPriority w:val="99"/>
-    <w:semiHidden/>
-    <w:unhideWhenUsed/>
-  </w:style>
-  <w:style w:type="paragraph" w:customStyle="1" w:styleId="B4175ACA770342328367EEFF9CBCD52B">
-    <w:name w:val="B4175ACA770342328367EEFF9CBCD52B"/>
-    <w:rsid w:val="00C116CA"/>
-  </w:style>
-  <w:style w:type="paragraph" w:customStyle="1" w:styleId="8E60BF54F81A47DDB05D7A2C89D68F48">
-    <w:name w:val="8E60BF54F81A47DDB05D7A2C89D68F48"/>
-    <w:rsid w:val="00C116CA"/>
-  </w:style>
-  <w:style w:type="paragraph" w:customStyle="1" w:styleId="F49996A308654360B751FA9F07FE3D8F">
-    <w:name w:val="F49996A308654360B751FA9F07FE3D8F"/>
-    <w:rsid w:val="00C116CA"/>
-  </w:style>
-</w:styles>
-</file>
-
-<file path=word/glossary/webSettings.xml><?xml version="1.0" encoding="utf-8"?>
-<w:webSettings xmlns:mc="http://schemas.openxmlformats.org/markup-compatibility/2006" xmlns:r="http://schemas.openxmlformats.org/officeDocument/2006/relationships" xmlns:w="http://schemas.openxmlformats.org/wordprocessingml/2006/main" xmlns:w14="http://schemas.microsoft.com/office/word/2010/wordml" xmlns:w15="http://schemas.microsoft.com/office/word/2012/wordml" xmlns:w16se="http://schemas.microsoft.com/office/word/2015/wordml/symex" mc:Ignorable="w14 w15 w16se">
-  <w:optimizeForBrowser/>
-  <w:allowPNG/>
-</w:webSettings>
-</file>
-
 <file path=word/theme/theme1.xml><?xml version="1.0" encoding="utf-8"?>
 <a:theme xmlns:a="http://schemas.openxmlformats.org/drawingml/2006/main" name="Office Theme">
   <a:themeElements>
@@ -9310,7 +8646,7 @@
 </file>
 
 <file path=customXml/itemProps1.xml><?xml version="1.0" encoding="utf-8"?>
-<ds:datastoreItem xmlns:ds="http://schemas.openxmlformats.org/officeDocument/2006/customXml" ds:itemID="{0515C89F-661D-4855-B17B-40E3C1EB31CB}">
+<ds:datastoreItem xmlns:ds="http://schemas.openxmlformats.org/officeDocument/2006/customXml" ds:itemID="{24818788-2420-4780-B047-F282F3C5A1F0}">
   <ds:schemaRefs>
     <ds:schemaRef ds:uri="http://schemas.openxmlformats.org/officeDocument/2006/bibliography"/>
   </ds:schemaRefs>

</xml_diff>